<commit_message>
Added answers for self-check questions
</commit_message>
<xml_diff>
--- a/09.CI-CD/Hometask.docx
+++ b/09.CI-CD/Hometask.docx
@@ -1,6 +1,6 @@
 
 <file path=word/document.xml><?xml version="1.0" encoding="utf-8"?>
-<w:document xmlns:wpc="http://schemas.microsoft.com/office/word/2010/wordprocessingCanvas" xmlns:cx="http://schemas.microsoft.com/office/drawing/2014/chartex" xmlns:cx1="http://schemas.microsoft.com/office/drawing/2015/9/8/chartex" xmlns:cx2="http://schemas.microsoft.com/office/drawing/2015/10/21/chartex" xmlns:cx3="http://schemas.microsoft.com/office/drawing/2016/5/9/chartex" xmlns:cx4="http://schemas.microsoft.com/office/drawing/2016/5/10/chartex" xmlns:cx5="http://schemas.microsoft.com/office/drawing/2016/5/11/chartex" xmlns:cx6="http://schemas.microsoft.com/office/drawing/2016/5/12/chartex" xmlns:cx7="http://schemas.microsoft.com/office/drawing/2016/5/13/chartex" xmlns:cx8="http://schemas.microsoft.com/office/drawing/2016/5/14/chartex" xmlns:mc="http://schemas.openxmlformats.org/markup-compatibility/2006" xmlns:aink="http://schemas.microsoft.com/office/drawing/2016/ink" xmlns:am3d="http://schemas.microsoft.com/office/drawing/2017/model3d" xmlns:o="urn:schemas-microsoft-com:office:office" xmlns:oel="http://schemas.microsoft.com/office/2019/extlst" xmlns:r="http://schemas.openxmlformats.org/officeDocument/2006/relationships" xmlns:m="http://schemas.openxmlformats.org/officeDocument/2006/math" xmlns:v="urn:schemas-microsoft-com:vml" xmlns:wp14="http://schemas.microsoft.com/office/word/2010/wordprocessingDrawing" xmlns:wp="http://schemas.openxmlformats.org/drawingml/2006/wordprocessingDrawing" xmlns:w10="urn:schemas-microsoft-com:office:word" xmlns:w="http://schemas.openxmlformats.org/wordprocessingml/2006/main" xmlns:w14="http://schemas.microsoft.com/office/word/2010/wordml" xmlns:w15="http://schemas.microsoft.com/office/word/2012/wordml" xmlns:w16cex="http://schemas.microsoft.com/office/word/2018/wordml/cex" xmlns:w16cid="http://schemas.microsoft.com/office/word/2016/wordml/cid" xmlns:w16="http://schemas.microsoft.com/office/word/2018/wordml" xmlns:w16du="http://schemas.microsoft.com/office/word/2023/wordml/word16du" xmlns:w16sdtdh="http://schemas.microsoft.com/office/word/2020/wordml/sdtdatahash" xmlns:w16sdtfl="http://schemas.microsoft.com/office/word/2024/wordml/sdtformatlock" xmlns:w16se="http://schemas.microsoft.com/office/word/2015/wordml/symex" xmlns:wpg="http://schemas.microsoft.com/office/word/2010/wordprocessingGroup" xmlns:wpi="http://schemas.microsoft.com/office/word/2010/wordprocessingInk" xmlns:wne="http://schemas.microsoft.com/office/word/2006/wordml" xmlns:wps="http://schemas.microsoft.com/office/word/2010/wordprocessingShape" mc:Ignorable="w14 w15 w16se w16cid w16 w16cex w16sdtdh w16sdtfl w16du wp14">
+<w:document xmlns:wpc="http://schemas.microsoft.com/office/word/2010/wordprocessingCanvas" xmlns:cx="http://schemas.microsoft.com/office/drawing/2014/chartex" xmlns:cx1="http://schemas.microsoft.com/office/drawing/2015/9/8/chartex" xmlns:cx2="http://schemas.microsoft.com/office/drawing/2015/10/21/chartex" xmlns:cx3="http://schemas.microsoft.com/office/drawing/2016/5/9/chartex" xmlns:cx4="http://schemas.microsoft.com/office/drawing/2016/5/10/chartex" xmlns:cx5="http://schemas.microsoft.com/office/drawing/2016/5/11/chartex" xmlns:cx6="http://schemas.microsoft.com/office/drawing/2016/5/12/chartex" xmlns:cx7="http://schemas.microsoft.com/office/drawing/2016/5/13/chartex" xmlns:cx8="http://schemas.microsoft.com/office/drawing/2016/5/14/chartex" xmlns:mc="http://schemas.openxmlformats.org/markup-compatibility/2006" xmlns:aink="http://schemas.microsoft.com/office/drawing/2016/ink" xmlns:am3d="http://schemas.microsoft.com/office/drawing/2017/model3d" xmlns:o="urn:schemas-microsoft-com:office:office" xmlns:oel="http://schemas.microsoft.com/office/2019/extlst" xmlns:r="http://schemas.openxmlformats.org/officeDocument/2006/relationships" xmlns:m="http://schemas.openxmlformats.org/officeDocument/2006/math" xmlns:v="urn:schemas-microsoft-com:vml" xmlns:wp14="http://schemas.microsoft.com/office/word/2010/wordprocessingDrawing" xmlns:wp="http://schemas.openxmlformats.org/drawingml/2006/wordprocessingDrawing" xmlns:w10="urn:schemas-microsoft-com:office:word" xmlns:w="http://schemas.openxmlformats.org/wordprocessingml/2006/main" xmlns:w14="http://schemas.microsoft.com/office/word/2010/wordml" xmlns:w15="http://schemas.microsoft.com/office/word/2012/wordml" xmlns:w16cei="http://schemas.microsoft.com/office/word/2026/wordml/cei" xmlns:w16cex="http://schemas.microsoft.com/office/word/2018/wordml/cex" xmlns:w16cid="http://schemas.microsoft.com/office/word/2016/wordml/cid" xmlns:w16="http://schemas.microsoft.com/office/word/2018/wordml" xmlns:w16du="http://schemas.microsoft.com/office/word/2023/wordml/word16du" xmlns:w16sdtdh="http://schemas.microsoft.com/office/word/2020/wordml/sdtdatahash" xmlns:w16sdtfl="http://schemas.microsoft.com/office/word/2024/wordml/sdtformatlock" xmlns:w16se="http://schemas.microsoft.com/office/word/2015/wordml/symex" xmlns:wpg="http://schemas.microsoft.com/office/word/2010/wordprocessingGroup" xmlns:wpi="http://schemas.microsoft.com/office/word/2010/wordprocessingInk" xmlns:wne="http://schemas.microsoft.com/office/word/2006/wordml" xmlns:wps="http://schemas.microsoft.com/office/word/2010/wordprocessingShape" mc:Ignorable="w14 w15 w16se w16cid w16 w16cex w16sdtdh w16sdtfl w16du wp14">
   <w:body>
     <w:p>
       <w:pPr>
@@ -145,21 +145,7 @@
         <w:rPr>
           <w:rFonts w:ascii="Verdana" w:hAnsi="Verdana"/>
         </w:rPr>
-        <w:t xml:space="preserve">Create CD pipelines for services in cloud or using container locally. Pipelines should include infrastructure provision using any </w:t>
-      </w:r>
-      <w:proofErr w:type="spellStart"/>
-      <w:r>
-        <w:rPr>
-          <w:rFonts w:ascii="Verdana" w:hAnsi="Verdana"/>
-        </w:rPr>
-        <w:t>IaC</w:t>
-      </w:r>
-      <w:proofErr w:type="spellEnd"/>
-      <w:r>
-        <w:rPr>
-          <w:rFonts w:ascii="Verdana" w:hAnsi="Verdana"/>
-        </w:rPr>
-        <w:t xml:space="preserve"> tool.</w:t>
+        <w:t>Create CD pipelines for services in cloud or using container locally. Pipelines should include infrastructure provision using any IaC tool.</w:t>
       </w:r>
     </w:p>
     <w:p/>
@@ -317,35 +303,7 @@
         <w:rPr>
           <w:rFonts w:ascii="Verdana" w:hAnsi="Verdana"/>
         </w:rPr>
-        <w:t xml:space="preserve">What is </w:t>
-      </w:r>
-      <w:proofErr w:type="spellStart"/>
-      <w:r>
-        <w:rPr>
-          <w:rFonts w:ascii="Verdana" w:hAnsi="Verdana"/>
-        </w:rPr>
-        <w:t>IaC</w:t>
-      </w:r>
-      <w:proofErr w:type="spellEnd"/>
-      <w:r>
-        <w:rPr>
-          <w:rFonts w:ascii="Verdana" w:hAnsi="Verdana"/>
-        </w:rPr>
-        <w:t xml:space="preserve">? What problem does it solve? Name several </w:t>
-      </w:r>
-      <w:proofErr w:type="spellStart"/>
-      <w:r>
-        <w:rPr>
-          <w:rFonts w:ascii="Verdana" w:hAnsi="Verdana"/>
-        </w:rPr>
-        <w:t>IaC</w:t>
-      </w:r>
-      <w:proofErr w:type="spellEnd"/>
-      <w:r>
-        <w:rPr>
-          <w:rFonts w:ascii="Verdana" w:hAnsi="Verdana"/>
-        </w:rPr>
-        <w:t xml:space="preserve"> tools.</w:t>
+        <w:t>What is IaC? What problem does it solve? Name several IaC tools.</w:t>
       </w:r>
     </w:p>
     <w:p>
@@ -364,21 +322,7 @@
         <w:rPr>
           <w:rFonts w:ascii="Verdana" w:hAnsi="Verdana"/>
         </w:rPr>
-        <w:t xml:space="preserve">How is </w:t>
-      </w:r>
-      <w:proofErr w:type="spellStart"/>
-      <w:r>
-        <w:rPr>
-          <w:rFonts w:ascii="Verdana" w:hAnsi="Verdana"/>
-        </w:rPr>
-        <w:t>IaC</w:t>
-      </w:r>
-      <w:proofErr w:type="spellEnd"/>
-      <w:r>
-        <w:rPr>
-          <w:rFonts w:ascii="Verdana" w:hAnsi="Verdana"/>
-        </w:rPr>
-        <w:t xml:space="preserve"> integrated into the CI/CD pipeline?</w:t>
+        <w:t>How is IaC integrated into the CI/CD pipeline?</w:t>
       </w:r>
     </w:p>
     <w:p>
@@ -534,6 +478,94 @@
           <w:lang w:val="ru-BY"/>
         </w:rPr>
       </w:pPr>
+      <w:r>
+        <w:rPr>
+          <w:rFonts w:ascii="Verdana" w:hAnsi="Verdana"/>
+          <w:lang w:val="ru-BY"/>
+        </w:rPr>
+        <w:t>CI/CD stands for Continuous Integration, Continuous Delivery, and sometimes Continuous Deployment.</w:t>
+      </w:r>
+    </w:p>
+    <w:p>
+      <w:pPr>
+        <w:spacing w:before="100" w:beforeAutospacing="1" w:line="240" w:lineRule="auto"/>
+        <w:ind w:left="360"/>
+        <w:jc w:val="both"/>
+        <w:rPr>
+          <w:rFonts w:ascii="Verdana" w:hAnsi="Verdana"/>
+          <w:lang w:val="ru-BY"/>
+        </w:rPr>
+      </w:pPr>
+      <w:r>
+        <w:rPr>
+          <w:rFonts w:ascii="Verdana" w:hAnsi="Verdana"/>
+          <w:b/>
+          <w:bCs/>
+          <w:lang w:val="ru-BY"/>
+        </w:rPr>
+        <w:t>Continuous Integration</w:t>
+      </w:r>
+      <w:r>
+        <w:rPr>
+          <w:rFonts w:ascii="Verdana" w:hAnsi="Verdana"/>
+          <w:lang w:val="ru-BY"/>
+        </w:rPr>
+        <w:t xml:space="preserve"> means developers frequently merge changes into a shared branch, and each change is automatically built and tested.</w:t>
+      </w:r>
+    </w:p>
+    <w:p>
+      <w:pPr>
+        <w:spacing w:before="100" w:beforeAutospacing="1" w:line="240" w:lineRule="auto"/>
+        <w:ind w:left="360"/>
+        <w:jc w:val="both"/>
+        <w:rPr>
+          <w:rFonts w:ascii="Verdana" w:hAnsi="Verdana"/>
+          <w:lang w:val="ru-BY"/>
+        </w:rPr>
+      </w:pPr>
+      <w:r>
+        <w:rPr>
+          <w:rFonts w:ascii="Verdana" w:hAnsi="Verdana"/>
+          <w:b/>
+          <w:bCs/>
+          <w:lang w:val="ru-BY"/>
+        </w:rPr>
+        <w:t>Continuous Delivery</w:t>
+      </w:r>
+      <w:r>
+        <w:rPr>
+          <w:rFonts w:ascii="Verdana" w:hAnsi="Verdana"/>
+          <w:lang w:val="ru-BY"/>
+        </w:rPr>
+        <w:t xml:space="preserve"> means every successful change is prepared and ready to be released to production, but the final production deployment usually requires a manual approval.</w:t>
+      </w:r>
+    </w:p>
+    <w:p>
+      <w:pPr>
+        <w:spacing w:before="100" w:beforeAutospacing="1" w:line="240" w:lineRule="auto"/>
+        <w:ind w:left="360"/>
+        <w:jc w:val="both"/>
+        <w:rPr>
+          <w:rFonts w:ascii="Verdana" w:hAnsi="Verdana"/>
+          <w:lang w:val="ru-BY"/>
+        </w:rPr>
+      </w:pPr>
+      <w:r>
+        <w:rPr>
+          <w:rFonts w:ascii="Verdana" w:hAnsi="Verdana"/>
+          <w:b/>
+          <w:bCs/>
+          <w:lang w:val="ru-BY"/>
+        </w:rPr>
+        <w:t>Continuous Deployment</w:t>
+      </w:r>
+      <w:r>
+        <w:rPr>
+          <w:rFonts w:ascii="Verdana" w:hAnsi="Verdana"/>
+          <w:lang w:val="ru-BY"/>
+        </w:rPr>
+        <w:t xml:space="preserve"> goes one step further: every change that passes all automated checks is automatically deployed to production without manual approval.</w:t>
+      </w:r>
     </w:p>
     <w:p>
       <w:pPr>
@@ -558,6 +590,428 @@
     </w:p>
     <w:p>
       <w:pPr>
+        <w:pStyle w:val="ListParagraph"/>
+        <w:numPr>
+          <w:ilvl w:val="0"/>
+          <w:numId w:val="9"/>
+        </w:numPr>
+        <w:spacing w:before="100" w:beforeAutospacing="1" w:line="240" w:lineRule="auto"/>
+        <w:jc w:val="both"/>
+        <w:rPr>
+          <w:rFonts w:ascii="Verdana" w:hAnsi="Verdana"/>
+        </w:rPr>
+      </w:pPr>
+      <w:r>
+        <w:rPr>
+          <w:rFonts w:ascii="Verdana" w:hAnsi="Verdana"/>
+        </w:rPr>
+        <w:t>Maintain a single source repository — Agree.</w:t>
+      </w:r>
+      <w:r>
+        <w:rPr>
+          <w:rFonts w:ascii="Verdana" w:hAnsi="Verdana"/>
+        </w:rPr>
+        <w:t xml:space="preserve"> </w:t>
+      </w:r>
+      <w:r>
+        <w:rPr>
+          <w:rFonts w:ascii="Verdana" w:hAnsi="Verdana"/>
+        </w:rPr>
+        <w:t>Rationale: keep feature/09.CI-CD changes centralized in the repo so CartService.* and CatalogService.* builds are reproducible.</w:t>
+      </w:r>
+    </w:p>
+    <w:p>
+      <w:pPr>
+        <w:pStyle w:val="ListParagraph"/>
+        <w:numPr>
+          <w:ilvl w:val="0"/>
+          <w:numId w:val="9"/>
+        </w:numPr>
+        <w:spacing w:before="100" w:beforeAutospacing="1" w:line="240" w:lineRule="auto"/>
+        <w:jc w:val="both"/>
+        <w:rPr>
+          <w:rFonts w:ascii="Verdana" w:hAnsi="Verdana"/>
+        </w:rPr>
+      </w:pPr>
+      <w:r>
+        <w:rPr>
+          <w:rFonts w:ascii="Verdana" w:hAnsi="Verdana"/>
+        </w:rPr>
+        <w:t>Automate the build — Agree.</w:t>
+      </w:r>
+      <w:r>
+        <w:rPr>
+          <w:rFonts w:ascii="Verdana" w:hAnsi="Verdana"/>
+        </w:rPr>
+        <w:t xml:space="preserve"> </w:t>
+      </w:r>
+      <w:r>
+        <w:rPr>
+          <w:rFonts w:ascii="Verdana" w:hAnsi="Verdana"/>
+        </w:rPr>
+        <w:t>Rationale: multi</w:t>
+      </w:r>
+      <w:r>
+        <w:rPr>
+          <w:rFonts w:ascii="Cambria Math" w:hAnsi="Cambria Math" w:cs="Cambria Math"/>
+        </w:rPr>
+        <w:t>‑</w:t>
+      </w:r>
+      <w:r>
+        <w:rPr>
+          <w:rFonts w:ascii="Verdana" w:hAnsi="Verdana"/>
+        </w:rPr>
+        <w:t>project solution (*.Api, *.Application, *.Domain, *.Infrastructure) benefits from automated, repeatable dotnet build in CI.</w:t>
+      </w:r>
+    </w:p>
+    <w:p>
+      <w:pPr>
+        <w:pStyle w:val="ListParagraph"/>
+        <w:numPr>
+          <w:ilvl w:val="0"/>
+          <w:numId w:val="9"/>
+        </w:numPr>
+        <w:spacing w:before="100" w:beforeAutospacing="1" w:line="240" w:lineRule="auto"/>
+        <w:jc w:val="both"/>
+        <w:rPr>
+          <w:rFonts w:ascii="Verdana" w:hAnsi="Verdana"/>
+        </w:rPr>
+      </w:pPr>
+      <w:r>
+        <w:rPr>
+          <w:rFonts w:ascii="Verdana" w:hAnsi="Verdana"/>
+        </w:rPr>
+        <w:t>Make the build self</w:t>
+      </w:r>
+      <w:r>
+        <w:rPr>
+          <w:rFonts w:ascii="Cambria Math" w:hAnsi="Cambria Math" w:cs="Cambria Math"/>
+        </w:rPr>
+        <w:t>‑</w:t>
+      </w:r>
+      <w:r>
+        <w:rPr>
+          <w:rFonts w:ascii="Verdana" w:hAnsi="Verdana"/>
+        </w:rPr>
+        <w:t xml:space="preserve">testing </w:t>
+      </w:r>
+      <w:r>
+        <w:rPr>
+          <w:rFonts w:ascii="Verdana" w:hAnsi="Verdana" w:cs="Verdana"/>
+        </w:rPr>
+        <w:t>—</w:t>
+      </w:r>
+      <w:r>
+        <w:rPr>
+          <w:rFonts w:ascii="Verdana" w:hAnsi="Verdana"/>
+        </w:rPr>
+        <w:t xml:space="preserve"> Agree.</w:t>
+      </w:r>
+      <w:r>
+        <w:rPr>
+          <w:rFonts w:ascii="Verdana" w:hAnsi="Verdana"/>
+        </w:rPr>
+        <w:t xml:space="preserve"> </w:t>
+      </w:r>
+      <w:r>
+        <w:rPr>
+          <w:rFonts w:ascii="Verdana" w:hAnsi="Verdana"/>
+        </w:rPr>
+        <w:t>Rationale: run CatalogService.UnitTests, CartService.Tests during the build so build failure equals test failure.</w:t>
+      </w:r>
+    </w:p>
+    <w:p>
+      <w:pPr>
+        <w:pStyle w:val="ListParagraph"/>
+        <w:numPr>
+          <w:ilvl w:val="0"/>
+          <w:numId w:val="9"/>
+        </w:numPr>
+        <w:spacing w:before="100" w:beforeAutospacing="1" w:line="240" w:lineRule="auto"/>
+        <w:jc w:val="both"/>
+        <w:rPr>
+          <w:rFonts w:ascii="Verdana" w:hAnsi="Verdana"/>
+        </w:rPr>
+      </w:pPr>
+      <w:r>
+        <w:rPr>
+          <w:rFonts w:ascii="Verdana" w:hAnsi="Verdana"/>
+        </w:rPr>
+        <w:t>Everyone commits to the mainline daily — Agree (with short</w:t>
+      </w:r>
+      <w:r>
+        <w:rPr>
+          <w:rFonts w:ascii="Cambria Math" w:hAnsi="Cambria Math" w:cs="Cambria Math"/>
+        </w:rPr>
+        <w:t>‑</w:t>
+      </w:r>
+      <w:r>
+        <w:rPr>
+          <w:rFonts w:ascii="Verdana" w:hAnsi="Verdana"/>
+        </w:rPr>
+        <w:t>lived branches).</w:t>
+      </w:r>
+      <w:r>
+        <w:rPr>
+          <w:rFonts w:ascii="Verdana" w:hAnsi="Verdana"/>
+        </w:rPr>
+        <w:t xml:space="preserve"> </w:t>
+      </w:r>
+      <w:r>
+        <w:rPr>
+          <w:rFonts w:ascii="Verdana" w:hAnsi="Verdana"/>
+        </w:rPr>
+        <w:t>Rationale: encourage small PRs from feature branches (like feature/09.CI-CD) merged frequently to reduce integration pain.</w:t>
+      </w:r>
+    </w:p>
+    <w:p>
+      <w:pPr>
+        <w:pStyle w:val="ListParagraph"/>
+        <w:numPr>
+          <w:ilvl w:val="0"/>
+          <w:numId w:val="9"/>
+        </w:numPr>
+        <w:spacing w:before="100" w:beforeAutospacing="1" w:line="240" w:lineRule="auto"/>
+        <w:jc w:val="both"/>
+        <w:rPr>
+          <w:rFonts w:ascii="Verdana" w:hAnsi="Verdana"/>
+        </w:rPr>
+      </w:pPr>
+      <w:r>
+        <w:rPr>
+          <w:rFonts w:ascii="Verdana" w:hAnsi="Verdana"/>
+        </w:rPr>
+        <w:t>Every commit should build the mainline on an integration machine — Agree.</w:t>
+      </w:r>
+      <w:r>
+        <w:rPr>
+          <w:rFonts w:ascii="Verdana" w:hAnsi="Verdana"/>
+        </w:rPr>
+        <w:t xml:space="preserve"> </w:t>
+      </w:r>
+      <w:r>
+        <w:rPr>
+          <w:rFonts w:ascii="Verdana" w:hAnsi="Verdana"/>
+        </w:rPr>
+        <w:t>Rationale: CI must build every PR/merge to main to detect regressions early across all projects.</w:t>
+      </w:r>
+    </w:p>
+    <w:p>
+      <w:pPr>
+        <w:pStyle w:val="ListParagraph"/>
+        <w:numPr>
+          <w:ilvl w:val="0"/>
+          <w:numId w:val="9"/>
+        </w:numPr>
+        <w:spacing w:before="100" w:beforeAutospacing="1" w:line="240" w:lineRule="auto"/>
+        <w:jc w:val="both"/>
+        <w:rPr>
+          <w:rFonts w:ascii="Verdana" w:hAnsi="Verdana"/>
+        </w:rPr>
+      </w:pPr>
+      <w:r>
+        <w:rPr>
+          <w:rFonts w:ascii="Verdana" w:hAnsi="Verdana"/>
+        </w:rPr>
+        <w:t>Keep the build fast — Agree.</w:t>
+      </w:r>
+      <w:r>
+        <w:rPr>
+          <w:rFonts w:ascii="Verdana" w:hAnsi="Verdana"/>
+        </w:rPr>
+        <w:t xml:space="preserve"> </w:t>
+      </w:r>
+      <w:r>
+        <w:rPr>
+          <w:rFonts w:ascii="Verdana" w:hAnsi="Verdana"/>
+        </w:rPr>
+        <w:t>Rationale: use caching (NuGet, SDK), parallel restore/build and split long integration tests to keep feedback loops short.</w:t>
+      </w:r>
+    </w:p>
+    <w:p>
+      <w:pPr>
+        <w:pStyle w:val="ListParagraph"/>
+        <w:numPr>
+          <w:ilvl w:val="0"/>
+          <w:numId w:val="9"/>
+        </w:numPr>
+        <w:spacing w:before="100" w:beforeAutospacing="1" w:line="240" w:lineRule="auto"/>
+        <w:jc w:val="both"/>
+        <w:rPr>
+          <w:rFonts w:ascii="Verdana" w:hAnsi="Verdana"/>
+        </w:rPr>
+      </w:pPr>
+      <w:r>
+        <w:rPr>
+          <w:rFonts w:ascii="Verdana" w:hAnsi="Verdana"/>
+        </w:rPr>
+        <w:t>Test in a clone of production — Agree (where feasible).</w:t>
+      </w:r>
+      <w:r>
+        <w:rPr>
+          <w:rFonts w:ascii="Verdana" w:hAnsi="Verdana"/>
+        </w:rPr>
+        <w:t xml:space="preserve"> </w:t>
+      </w:r>
+      <w:r>
+        <w:rPr>
+          <w:rFonts w:ascii="Verdana" w:hAnsi="Verdana"/>
+        </w:rPr>
+        <w:t>Rationale: run integration tests in containerized or staging environments that mirror production for *.Api services.</w:t>
+      </w:r>
+    </w:p>
+    <w:p>
+      <w:pPr>
+        <w:pStyle w:val="ListParagraph"/>
+        <w:numPr>
+          <w:ilvl w:val="0"/>
+          <w:numId w:val="9"/>
+        </w:numPr>
+        <w:spacing w:before="100" w:beforeAutospacing="1" w:line="240" w:lineRule="auto"/>
+        <w:jc w:val="both"/>
+        <w:rPr>
+          <w:rFonts w:ascii="Verdana" w:hAnsi="Verdana"/>
+        </w:rPr>
+      </w:pPr>
+      <w:r>
+        <w:rPr>
+          <w:rFonts w:ascii="Verdana" w:hAnsi="Verdana"/>
+        </w:rPr>
+        <w:lastRenderedPageBreak/>
+        <w:t>Make it easy to get the latest deliverables — Agree.</w:t>
+      </w:r>
+      <w:r>
+        <w:rPr>
+          <w:rFonts w:ascii="Verdana" w:hAnsi="Verdana"/>
+        </w:rPr>
+        <w:t xml:space="preserve"> </w:t>
+      </w:r>
+      <w:r>
+        <w:rPr>
+          <w:rFonts w:ascii="Verdana" w:hAnsi="Verdana"/>
+        </w:rPr>
+        <w:t>Rationale: CI should publish versioned artifacts/Docker images so teams can pull tested builds for releases or debugging.</w:t>
+      </w:r>
+    </w:p>
+    <w:p>
+      <w:pPr>
+        <w:pStyle w:val="ListParagraph"/>
+        <w:numPr>
+          <w:ilvl w:val="0"/>
+          <w:numId w:val="9"/>
+        </w:numPr>
+        <w:spacing w:before="100" w:beforeAutospacing="1" w:line="240" w:lineRule="auto"/>
+        <w:jc w:val="both"/>
+        <w:rPr>
+          <w:rFonts w:ascii="Verdana" w:hAnsi="Verdana"/>
+        </w:rPr>
+      </w:pPr>
+      <w:r>
+        <w:rPr>
+          <w:rFonts w:ascii="Verdana" w:hAnsi="Verdana"/>
+        </w:rPr>
+        <w:t>Everyone can see the results of the latest build — Agree.</w:t>
+      </w:r>
+      <w:r>
+        <w:rPr>
+          <w:rFonts w:ascii="Verdana" w:hAnsi="Verdana"/>
+        </w:rPr>
+        <w:t xml:space="preserve"> </w:t>
+      </w:r>
+      <w:r>
+        <w:rPr>
+          <w:rFonts w:ascii="Verdana" w:hAnsi="Verdana"/>
+        </w:rPr>
+        <w:t>Rationale: surface build/test status in PRs and dashboards so CartService and CatalogService teams know health at a glance.</w:t>
+      </w:r>
+    </w:p>
+    <w:p>
+      <w:pPr>
+        <w:pStyle w:val="ListParagraph"/>
+        <w:numPr>
+          <w:ilvl w:val="0"/>
+          <w:numId w:val="9"/>
+        </w:numPr>
+        <w:spacing w:before="100" w:beforeAutospacing="1" w:line="240" w:lineRule="auto"/>
+        <w:jc w:val="both"/>
+        <w:rPr>
+          <w:rFonts w:ascii="Verdana" w:hAnsi="Verdana"/>
+        </w:rPr>
+      </w:pPr>
+      <w:r>
+        <w:rPr>
+          <w:rFonts w:ascii="Verdana" w:hAnsi="Verdana"/>
+        </w:rPr>
+        <w:t>Automate deployment — Agree (with gates).</w:t>
+      </w:r>
+      <w:r>
+        <w:rPr>
+          <w:rFonts w:ascii="Verdana" w:hAnsi="Verdana"/>
+        </w:rPr>
+        <w:t xml:space="preserve"> </w:t>
+      </w:r>
+      <w:r>
+        <w:rPr>
+          <w:rFonts w:ascii="Verdana" w:hAnsi="Verdana"/>
+        </w:rPr>
+        <w:t>Rationale: automate to staging; require approvals or promotion for production to avoid accidental releases.</w:t>
+      </w:r>
+    </w:p>
+    <w:p>
+      <w:pPr>
+        <w:pStyle w:val="ListParagraph"/>
+        <w:numPr>
+          <w:ilvl w:val="0"/>
+          <w:numId w:val="9"/>
+        </w:numPr>
+        <w:spacing w:before="100" w:beforeAutospacing="1" w:line="240" w:lineRule="auto"/>
+        <w:jc w:val="both"/>
+        <w:rPr>
+          <w:rFonts w:ascii="Verdana" w:hAnsi="Verdana"/>
+        </w:rPr>
+      </w:pPr>
+      <w:r>
+        <w:rPr>
+          <w:rFonts w:ascii="Verdana" w:hAnsi="Verdana"/>
+        </w:rPr>
+        <w:t>Fix broken builds immediately — Agree.</w:t>
+      </w:r>
+      <w:r>
+        <w:rPr>
+          <w:rFonts w:ascii="Verdana" w:hAnsi="Verdana"/>
+        </w:rPr>
+        <w:t xml:space="preserve"> </w:t>
+      </w:r>
+      <w:r>
+        <w:rPr>
+          <w:rFonts w:ascii="Verdana" w:hAnsi="Verdana"/>
+        </w:rPr>
+        <w:t>Rationale: make failing builds high priority; failing CI blocks merges until resolved to keep main healthy.</w:t>
+      </w:r>
+    </w:p>
+    <w:p>
+      <w:pPr>
+        <w:numPr>
+          <w:ilvl w:val="0"/>
+          <w:numId w:val="3"/>
+        </w:numPr>
+        <w:spacing w:before="100" w:beforeAutospacing="1" w:line="240" w:lineRule="auto"/>
+        <w:jc w:val="both"/>
+        <w:rPr>
+          <w:rFonts w:ascii="Verdana" w:hAnsi="Verdana"/>
+          <w:lang w:val="ru-BY"/>
+        </w:rPr>
+      </w:pPr>
+      <w:r>
+        <w:rPr>
+          <w:rFonts w:ascii="Verdana" w:hAnsi="Verdana"/>
+          <w:lang w:val="ru-BY"/>
+        </w:rPr>
+        <w:t>What branching strategies exist? Does your current project follow any branching strategies, is it the best one, in your opinion?</w:t>
+      </w:r>
+    </w:p>
+    <w:p>
+      <w:pPr>
         <w:spacing w:before="100" w:beforeAutospacing="1" w:line="240" w:lineRule="auto"/>
         <w:ind w:left="360"/>
         <w:jc w:val="both"/>
@@ -566,26 +1020,107 @@
           <w:lang w:val="ru-BY"/>
         </w:rPr>
       </w:pPr>
-    </w:p>
-    <w:p>
-      <w:pPr>
-        <w:numPr>
-          <w:ilvl w:val="0"/>
-          <w:numId w:val="3"/>
-        </w:numPr>
-        <w:spacing w:before="100" w:beforeAutospacing="1" w:line="240" w:lineRule="auto"/>
-        <w:jc w:val="both"/>
-        <w:rPr>
-          <w:rFonts w:ascii="Verdana" w:hAnsi="Verdana"/>
-          <w:lang w:val="ru-BY"/>
-        </w:rPr>
-      </w:pPr>
-      <w:r>
-        <w:rPr>
-          <w:rFonts w:ascii="Verdana" w:hAnsi="Verdana"/>
-          <w:lang w:val="ru-BY"/>
-        </w:rPr>
-        <w:t>What branching strategies exist? Does your current project follow any branching strategies, is it the best one, in your opinion?</w:t>
+      <w:r>
+        <w:rPr>
+          <w:rFonts w:ascii="Verdana" w:hAnsi="Verdana"/>
+          <w:lang w:val="ru-BY"/>
+        </w:rPr>
+        <w:t>Some of the popular branching strategies</w:t>
+      </w:r>
+      <w:r>
+        <w:rPr>
+          <w:rFonts w:ascii="Verdana" w:hAnsi="Verdana"/>
+          <w:lang w:val="ru-BY"/>
+        </w:rPr>
+        <w:t>:</w:t>
+      </w:r>
+    </w:p>
+    <w:p>
+      <w:pPr>
+        <w:pStyle w:val="ListParagraph"/>
+        <w:numPr>
+          <w:ilvl w:val="0"/>
+          <w:numId w:val="4"/>
+        </w:numPr>
+        <w:spacing w:before="100" w:beforeAutospacing="1" w:line="240" w:lineRule="auto"/>
+        <w:jc w:val="both"/>
+        <w:rPr>
+          <w:rFonts w:ascii="Verdana" w:hAnsi="Verdana"/>
+          <w:lang w:val="ru-BY"/>
+        </w:rPr>
+      </w:pPr>
+      <w:r>
+        <w:rPr>
+          <w:rFonts w:ascii="Verdana" w:hAnsi="Verdana"/>
+          <w:lang w:val="ru-BY"/>
+        </w:rPr>
+        <w:t>GitFlow</w:t>
+      </w:r>
+    </w:p>
+    <w:p>
+      <w:pPr>
+        <w:pStyle w:val="ListParagraph"/>
+        <w:numPr>
+          <w:ilvl w:val="0"/>
+          <w:numId w:val="4"/>
+        </w:numPr>
+        <w:spacing w:before="100" w:beforeAutospacing="1" w:line="240" w:lineRule="auto"/>
+        <w:jc w:val="both"/>
+        <w:rPr>
+          <w:rFonts w:ascii="Verdana" w:hAnsi="Verdana"/>
+          <w:lang w:val="ru-BY"/>
+        </w:rPr>
+      </w:pPr>
+      <w:r>
+        <w:rPr>
+          <w:rFonts w:ascii="Verdana" w:hAnsi="Verdana"/>
+          <w:lang w:val="ru-BY"/>
+        </w:rPr>
+        <w:t>GitHub Flow</w:t>
+      </w:r>
+    </w:p>
+    <w:p>
+      <w:pPr>
+        <w:pStyle w:val="ListParagraph"/>
+        <w:numPr>
+          <w:ilvl w:val="0"/>
+          <w:numId w:val="4"/>
+        </w:numPr>
+        <w:spacing w:before="100" w:beforeAutospacing="1" w:line="240" w:lineRule="auto"/>
+        <w:jc w:val="both"/>
+        <w:rPr>
+          <w:rFonts w:ascii="Verdana" w:hAnsi="Verdana"/>
+          <w:lang w:val="ru-BY"/>
+        </w:rPr>
+      </w:pPr>
+      <w:r>
+        <w:rPr>
+          <w:rFonts w:ascii="Verdana" w:hAnsi="Verdana"/>
+          <w:lang w:val="ru-BY"/>
+        </w:rPr>
+        <w:t>Trunk-based development</w:t>
+      </w:r>
+    </w:p>
+    <w:p>
+      <w:pPr>
+        <w:pStyle w:val="ListParagraph"/>
+        <w:numPr>
+          <w:ilvl w:val="0"/>
+          <w:numId w:val="4"/>
+        </w:numPr>
+        <w:spacing w:before="100" w:beforeAutospacing="1" w:line="240" w:lineRule="auto"/>
+        <w:jc w:val="both"/>
+        <w:rPr>
+          <w:rFonts w:ascii="Verdana" w:hAnsi="Verdana"/>
+          <w:lang w:val="ru-BY"/>
+        </w:rPr>
+      </w:pPr>
+      <w:r>
+        <w:rPr>
+          <w:rFonts w:ascii="Verdana" w:hAnsi="Verdana"/>
+          <w:lang w:val="ru-BY"/>
+        </w:rPr>
+        <w:t>Forking workflow</w:t>
       </w:r>
     </w:p>
     <w:p>
@@ -598,6 +1133,31 @@
           <w:lang w:val="ru-BY"/>
         </w:rPr>
       </w:pPr>
+      <w:r>
+        <w:rPr>
+          <w:rFonts w:ascii="Verdana" w:hAnsi="Verdana"/>
+          <w:lang w:val="ru-BY"/>
+        </w:rPr>
+        <w:t>My current project follows a simplified GitHub Flow: there is one main long-lived branch, and each learning module is developed in a separate feature branch and merged back after completion. For a small educational project with one developer, this approach is sufficient because it is simple and avoids unnecessary branching complexity.</w:t>
+      </w:r>
+    </w:p>
+    <w:p>
+      <w:pPr>
+        <w:spacing w:before="100" w:beforeAutospacing="1" w:line="240" w:lineRule="auto"/>
+        <w:ind w:left="360"/>
+        <w:jc w:val="both"/>
+        <w:rPr>
+          <w:rFonts w:ascii="Verdana" w:hAnsi="Verdana"/>
+          <w:lang w:val="ru-BY"/>
+        </w:rPr>
+      </w:pPr>
+      <w:r>
+        <w:rPr>
+          <w:rFonts w:ascii="Verdana" w:hAnsi="Verdana"/>
+          <w:lang w:val="ru-BY"/>
+        </w:rPr>
+        <w:t>For a larger team, I would prefer short-lived feature branches or trunk-based development to reduce merge conflicts and integration problems.</w:t>
+      </w:r>
     </w:p>
     <w:p>
       <w:pPr>
@@ -638,7 +1198,221 @@
           <w:rFonts w:ascii="Verdana" w:hAnsi="Verdana"/>
           <w:lang w:val="ru-BY"/>
         </w:rPr>
-        <w:tab/>
+        <w:t xml:space="preserve">Some of the popular </w:t>
+      </w:r>
+      <w:r>
+        <w:rPr>
+          <w:rFonts w:ascii="Verdana" w:hAnsi="Verdana"/>
+          <w:lang w:val="ru-BY"/>
+        </w:rPr>
+        <w:t xml:space="preserve">deployment </w:t>
+      </w:r>
+      <w:r>
+        <w:rPr>
+          <w:rFonts w:ascii="Verdana" w:hAnsi="Verdana"/>
+          <w:lang w:val="ru-BY"/>
+        </w:rPr>
+        <w:t>strategies</w:t>
+      </w:r>
+      <w:r>
+        <w:rPr>
+          <w:rFonts w:ascii="Verdana" w:hAnsi="Verdana"/>
+          <w:lang w:val="ru-BY"/>
+        </w:rPr>
+        <w:t>:</w:t>
+      </w:r>
+    </w:p>
+    <w:p>
+      <w:pPr>
+        <w:pStyle w:val="ListParagraph"/>
+        <w:numPr>
+          <w:ilvl w:val="0"/>
+          <w:numId w:val="6"/>
+        </w:numPr>
+        <w:tabs>
+          <w:tab w:val="left" w:pos="1200"/>
+        </w:tabs>
+        <w:spacing w:before="100" w:beforeAutospacing="1" w:line="240" w:lineRule="auto"/>
+        <w:jc w:val="both"/>
+        <w:rPr>
+          <w:rFonts w:ascii="Verdana" w:hAnsi="Verdana"/>
+          <w:lang w:val="ru-BY"/>
+        </w:rPr>
+      </w:pPr>
+      <w:r>
+        <w:rPr>
+          <w:rFonts w:ascii="Verdana" w:hAnsi="Verdana"/>
+          <w:lang w:val="ru-BY"/>
+        </w:rPr>
+        <w:t>Big-bang deployment</w:t>
+      </w:r>
+    </w:p>
+    <w:p>
+      <w:pPr>
+        <w:pStyle w:val="ListParagraph"/>
+        <w:numPr>
+          <w:ilvl w:val="0"/>
+          <w:numId w:val="6"/>
+        </w:numPr>
+        <w:tabs>
+          <w:tab w:val="left" w:pos="1200"/>
+        </w:tabs>
+        <w:spacing w:before="100" w:beforeAutospacing="1" w:line="240" w:lineRule="auto"/>
+        <w:jc w:val="both"/>
+        <w:rPr>
+          <w:rFonts w:ascii="Verdana" w:hAnsi="Verdana"/>
+          <w:lang w:val="ru-BY"/>
+        </w:rPr>
+      </w:pPr>
+      <w:r>
+        <w:rPr>
+          <w:rFonts w:ascii="Verdana" w:hAnsi="Verdana"/>
+          <w:lang w:val="ru-BY"/>
+        </w:rPr>
+        <w:t>Rolling (aka incremental or ramped) deployments</w:t>
+      </w:r>
+    </w:p>
+    <w:p>
+      <w:pPr>
+        <w:pStyle w:val="ListParagraph"/>
+        <w:numPr>
+          <w:ilvl w:val="0"/>
+          <w:numId w:val="6"/>
+        </w:numPr>
+        <w:tabs>
+          <w:tab w:val="left" w:pos="1200"/>
+        </w:tabs>
+        <w:spacing w:before="100" w:beforeAutospacing="1" w:line="240" w:lineRule="auto"/>
+        <w:jc w:val="both"/>
+        <w:rPr>
+          <w:rFonts w:ascii="Verdana" w:hAnsi="Verdana"/>
+          <w:lang w:val="ru-BY"/>
+        </w:rPr>
+      </w:pPr>
+      <w:r>
+        <w:rPr>
+          <w:rFonts w:ascii="Verdana" w:hAnsi="Verdana"/>
+          <w:lang w:val="ru-BY"/>
+        </w:rPr>
+        <w:t>Recreate deployments</w:t>
+      </w:r>
+    </w:p>
+    <w:p>
+      <w:pPr>
+        <w:pStyle w:val="ListParagraph"/>
+        <w:numPr>
+          <w:ilvl w:val="0"/>
+          <w:numId w:val="6"/>
+        </w:numPr>
+        <w:tabs>
+          <w:tab w:val="left" w:pos="1200"/>
+        </w:tabs>
+        <w:spacing w:before="100" w:beforeAutospacing="1" w:line="240" w:lineRule="auto"/>
+        <w:jc w:val="both"/>
+        <w:rPr>
+          <w:rFonts w:ascii="Verdana" w:hAnsi="Verdana"/>
+          <w:lang w:val="ru-BY"/>
+        </w:rPr>
+      </w:pPr>
+      <w:r>
+        <w:rPr>
+          <w:rFonts w:ascii="Verdana" w:hAnsi="Verdana"/>
+          <w:lang w:val="ru-BY"/>
+        </w:rPr>
+        <w:t>Canary deployments</w:t>
+      </w:r>
+    </w:p>
+    <w:p>
+      <w:pPr>
+        <w:pStyle w:val="ListParagraph"/>
+        <w:numPr>
+          <w:ilvl w:val="0"/>
+          <w:numId w:val="6"/>
+        </w:numPr>
+        <w:tabs>
+          <w:tab w:val="left" w:pos="1200"/>
+        </w:tabs>
+        <w:spacing w:before="100" w:beforeAutospacing="1" w:line="240" w:lineRule="auto"/>
+        <w:jc w:val="both"/>
+        <w:rPr>
+          <w:rFonts w:ascii="Verdana" w:hAnsi="Verdana"/>
+          <w:lang w:val="ru-BY"/>
+        </w:rPr>
+      </w:pPr>
+      <w:r>
+        <w:rPr>
+          <w:rFonts w:ascii="Verdana" w:hAnsi="Verdana"/>
+          <w:lang w:val="ru-BY"/>
+        </w:rPr>
+        <w:t>Blue/green deployments</w:t>
+      </w:r>
+    </w:p>
+    <w:p>
+      <w:pPr>
+        <w:pStyle w:val="ListParagraph"/>
+        <w:numPr>
+          <w:ilvl w:val="0"/>
+          <w:numId w:val="6"/>
+        </w:numPr>
+        <w:tabs>
+          <w:tab w:val="left" w:pos="1200"/>
+        </w:tabs>
+        <w:spacing w:before="100" w:beforeAutospacing="1" w:line="240" w:lineRule="auto"/>
+        <w:jc w:val="both"/>
+        <w:rPr>
+          <w:rFonts w:ascii="Verdana" w:hAnsi="Verdana"/>
+          <w:lang w:val="ru-BY"/>
+        </w:rPr>
+      </w:pPr>
+      <w:r>
+        <w:rPr>
+          <w:rFonts w:ascii="Verdana" w:hAnsi="Verdana"/>
+          <w:lang w:val="ru-BY"/>
+        </w:rPr>
+        <w:t>Shadow deployments</w:t>
+      </w:r>
+    </w:p>
+    <w:p>
+      <w:pPr>
+        <w:tabs>
+          <w:tab w:val="left" w:pos="1200"/>
+        </w:tabs>
+        <w:spacing w:before="100" w:beforeAutospacing="1" w:line="240" w:lineRule="auto"/>
+        <w:ind w:left="360"/>
+        <w:jc w:val="both"/>
+        <w:rPr>
+          <w:rFonts w:ascii="Verdana" w:hAnsi="Verdana"/>
+          <w:lang w:val="ru-BY"/>
+        </w:rPr>
+      </w:pPr>
+      <w:r>
+        <w:rPr>
+          <w:rFonts w:ascii="Verdana" w:hAnsi="Verdana"/>
+          <w:lang w:val="ru-BY"/>
+        </w:rPr>
+        <w:lastRenderedPageBreak/>
+        <w:t>My training project follows the simplest deployment strategy: big-bang deployment. This is acceptable because there are no real users and no production availability requirements.</w:t>
+      </w:r>
+    </w:p>
+    <w:p>
+      <w:pPr>
+        <w:tabs>
+          <w:tab w:val="left" w:pos="1200"/>
+        </w:tabs>
+        <w:spacing w:before="100" w:beforeAutospacing="1" w:line="240" w:lineRule="auto"/>
+        <w:ind w:left="360"/>
+        <w:jc w:val="both"/>
+        <w:rPr>
+          <w:rFonts w:ascii="Verdana" w:hAnsi="Verdana"/>
+          <w:lang w:val="ru-BY"/>
+        </w:rPr>
+      </w:pPr>
+      <w:r>
+        <w:rPr>
+          <w:rFonts w:ascii="Verdana" w:hAnsi="Verdana"/>
+          <w:lang w:val="ru-BY"/>
+        </w:rPr>
+        <w:t>For a real production system, I would prefer rolling, blue/green, or canary deployment depending on the required availability, risk level, and infrastructure support.</w:t>
       </w:r>
     </w:p>
     <w:p>
@@ -672,6 +1446,181 @@
           <w:lang w:val="ru-BY"/>
         </w:rPr>
       </w:pPr>
+      <w:r>
+        <w:rPr>
+          <w:rFonts w:ascii="Verdana" w:hAnsi="Verdana"/>
+          <w:lang w:val="ru-BY"/>
+        </w:rPr>
+        <w:t>CI/CD implementation tools</w:t>
+      </w:r>
+      <w:r>
+        <w:rPr>
+          <w:rFonts w:ascii="Verdana" w:hAnsi="Verdana"/>
+          <w:lang w:val="ru-BY"/>
+        </w:rPr>
+        <w:t>:</w:t>
+      </w:r>
+    </w:p>
+    <w:p>
+      <w:pPr>
+        <w:pStyle w:val="ListParagraph"/>
+        <w:numPr>
+          <w:ilvl w:val="0"/>
+          <w:numId w:val="5"/>
+        </w:numPr>
+        <w:spacing w:before="100" w:beforeAutospacing="1" w:line="240" w:lineRule="auto"/>
+        <w:jc w:val="both"/>
+        <w:rPr>
+          <w:rFonts w:ascii="Verdana" w:hAnsi="Verdana"/>
+          <w:lang w:val="ru-BY"/>
+        </w:rPr>
+      </w:pPr>
+      <w:hyperlink r:id="rId5" w:history="1">
+        <w:r>
+          <w:rPr>
+            <w:rStyle w:val="Hyperlink"/>
+            <w:rFonts w:ascii="Verdana" w:hAnsi="Verdana"/>
+            <w:lang w:val="ru-BY"/>
+          </w:rPr>
+          <w:t>TeamCity</w:t>
+        </w:r>
+      </w:hyperlink>
+    </w:p>
+    <w:p>
+      <w:pPr>
+        <w:pStyle w:val="ListParagraph"/>
+        <w:numPr>
+          <w:ilvl w:val="0"/>
+          <w:numId w:val="5"/>
+        </w:numPr>
+        <w:spacing w:before="100" w:beforeAutospacing="1" w:line="240" w:lineRule="auto"/>
+        <w:jc w:val="both"/>
+        <w:rPr>
+          <w:rFonts w:ascii="Verdana" w:hAnsi="Verdana"/>
+          <w:lang w:val="ru-BY"/>
+        </w:rPr>
+      </w:pPr>
+      <w:hyperlink r:id="rId6" w:history="1">
+        <w:r>
+          <w:rPr>
+            <w:rStyle w:val="Hyperlink"/>
+            <w:rFonts w:ascii="Verdana" w:hAnsi="Verdana"/>
+            <w:lang w:val="ru-BY"/>
+          </w:rPr>
+          <w:t>GitLab</w:t>
+        </w:r>
+      </w:hyperlink>
+    </w:p>
+    <w:p>
+      <w:pPr>
+        <w:pStyle w:val="ListParagraph"/>
+        <w:numPr>
+          <w:ilvl w:val="0"/>
+          <w:numId w:val="5"/>
+        </w:numPr>
+        <w:spacing w:before="100" w:beforeAutospacing="1" w:line="240" w:lineRule="auto"/>
+        <w:jc w:val="both"/>
+        <w:rPr>
+          <w:rFonts w:ascii="Verdana" w:hAnsi="Verdana"/>
+          <w:lang w:val="ru-BY"/>
+        </w:rPr>
+      </w:pPr>
+      <w:hyperlink r:id="rId7" w:history="1">
+        <w:r>
+          <w:rPr>
+            <w:rStyle w:val="Hyperlink"/>
+            <w:rFonts w:ascii="Verdana" w:hAnsi="Verdana"/>
+            <w:lang w:val="ru-BY"/>
+          </w:rPr>
+          <w:t>GitHub Actions</w:t>
+        </w:r>
+      </w:hyperlink>
+    </w:p>
+    <w:p>
+      <w:pPr>
+        <w:pStyle w:val="ListParagraph"/>
+        <w:numPr>
+          <w:ilvl w:val="0"/>
+          <w:numId w:val="5"/>
+        </w:numPr>
+        <w:spacing w:before="100" w:beforeAutospacing="1" w:line="240" w:lineRule="auto"/>
+        <w:jc w:val="both"/>
+        <w:rPr>
+          <w:rFonts w:ascii="Verdana" w:hAnsi="Verdana"/>
+          <w:lang w:val="ru-BY"/>
+        </w:rPr>
+      </w:pPr>
+      <w:hyperlink r:id="rId8" w:history="1">
+        <w:r>
+          <w:rPr>
+            <w:rStyle w:val="Hyperlink"/>
+            <w:rFonts w:ascii="Verdana" w:hAnsi="Verdana"/>
+            <w:lang w:val="ru-BY"/>
+          </w:rPr>
+          <w:t>Azure DevOps</w:t>
+        </w:r>
+      </w:hyperlink>
+    </w:p>
+    <w:p>
+      <w:pPr>
+        <w:pStyle w:val="ListParagraph"/>
+        <w:numPr>
+          <w:ilvl w:val="0"/>
+          <w:numId w:val="5"/>
+        </w:numPr>
+        <w:spacing w:before="100" w:beforeAutospacing="1" w:line="240" w:lineRule="auto"/>
+        <w:jc w:val="both"/>
+        <w:rPr>
+          <w:rFonts w:ascii="Verdana" w:hAnsi="Verdana"/>
+          <w:lang w:val="ru-BY"/>
+        </w:rPr>
+      </w:pPr>
+      <w:hyperlink r:id="rId9" w:history="1">
+        <w:r>
+          <w:rPr>
+            <w:rStyle w:val="Hyperlink"/>
+            <w:rFonts w:ascii="Verdana" w:hAnsi="Verdana"/>
+            <w:lang w:val="ru-BY"/>
+          </w:rPr>
+          <w:t>Jenkins</w:t>
+        </w:r>
+      </w:hyperlink>
+    </w:p>
+    <w:p>
+      <w:pPr>
+        <w:spacing w:before="100" w:beforeAutospacing="1" w:line="240" w:lineRule="auto"/>
+        <w:ind w:left="360"/>
+        <w:jc w:val="both"/>
+        <w:rPr>
+          <w:rFonts w:ascii="Verdana" w:hAnsi="Verdana"/>
+          <w:lang w:val="ru-BY"/>
+        </w:rPr>
+      </w:pPr>
+      <w:r>
+        <w:rPr>
+          <w:rFonts w:ascii="Verdana" w:hAnsi="Verdana"/>
+          <w:lang w:val="ru-BY"/>
+        </w:rPr>
+        <w:t>I would use Jenkins when a project requires a highly customizable, self-hosted CI/CD solution, especially in on-premise or legacy environments. Jenkins is also useful when a company already has Jenkins infrastructure, custom plugins, or complex pipeline requirements that are difficult to implement in more opinionated CI/CD platforms.</w:t>
+      </w:r>
+    </w:p>
+    <w:p>
+      <w:pPr>
+        <w:spacing w:before="100" w:beforeAutospacing="1" w:line="240" w:lineRule="auto"/>
+        <w:ind w:left="360"/>
+        <w:jc w:val="both"/>
+        <w:rPr>
+          <w:rFonts w:ascii="Verdana" w:hAnsi="Verdana"/>
+          <w:lang w:val="ru-BY"/>
+        </w:rPr>
+      </w:pPr>
+      <w:r>
+        <w:rPr>
+          <w:rFonts w:ascii="Verdana" w:hAnsi="Verdana"/>
+          <w:lang w:val="ru-BY"/>
+        </w:rPr>
+        <w:t>However, Jenkins requires more maintenance compared to managed solutions like GitHub Actions, GitLab CI/CD, or Azure DevOps.</w:t>
+      </w:r>
     </w:p>
     <w:p>
       <w:pPr>
@@ -704,6 +1653,186 @@
           <w:lang w:val="ru-BY"/>
         </w:rPr>
       </w:pPr>
+      <w:r>
+        <w:rPr>
+          <w:rFonts w:ascii="Verdana" w:hAnsi="Verdana"/>
+          <w:lang w:val="ru-BY"/>
+        </w:rPr>
+        <w:t>Infrastructure as Code, or IaC, is the practice of defining infrastructure using code or declarative configuration files. Instead of manually creating servers, networks, databases, or load balancers, the desired infrastructure state is described in code and applied automatically.</w:t>
+      </w:r>
+    </w:p>
+    <w:p>
+      <w:pPr>
+        <w:spacing w:before="100" w:beforeAutospacing="1" w:line="240" w:lineRule="auto"/>
+        <w:ind w:left="360"/>
+        <w:jc w:val="both"/>
+        <w:rPr>
+          <w:rFonts w:ascii="Verdana" w:hAnsi="Verdana"/>
+          <w:lang w:val="ru-BY"/>
+        </w:rPr>
+      </w:pPr>
+      <w:r>
+        <w:rPr>
+          <w:rFonts w:ascii="Verdana" w:hAnsi="Verdana"/>
+          <w:lang w:val="ru-BY"/>
+        </w:rPr>
+        <w:t>IaC solves problems such as manual configuration, environment drift, inconsistent environments, missing dependencies, and hard-to-repeat deployments. Since infrastructure definitions are stored in version control, changes can be reviewed, tested, reused, and rolled back.</w:t>
+      </w:r>
+    </w:p>
+    <w:p>
+      <w:pPr>
+        <w:spacing w:before="100" w:beforeAutospacing="1" w:line="240" w:lineRule="auto"/>
+        <w:ind w:left="360"/>
+        <w:jc w:val="both"/>
+        <w:rPr>
+          <w:rFonts w:ascii="Verdana" w:hAnsi="Verdana"/>
+          <w:lang w:val="ru-BY"/>
+        </w:rPr>
+      </w:pPr>
+    </w:p>
+    <w:p>
+      <w:pPr>
+        <w:spacing w:before="100" w:beforeAutospacing="1" w:line="240" w:lineRule="auto"/>
+        <w:ind w:left="360"/>
+        <w:jc w:val="both"/>
+        <w:rPr>
+          <w:rFonts w:ascii="Verdana" w:hAnsi="Verdana"/>
+          <w:lang w:val="ru-BY"/>
+        </w:rPr>
+      </w:pPr>
+    </w:p>
+    <w:p>
+      <w:pPr>
+        <w:spacing w:before="100" w:beforeAutospacing="1" w:line="240" w:lineRule="auto"/>
+        <w:ind w:left="360"/>
+        <w:jc w:val="both"/>
+        <w:rPr>
+          <w:rFonts w:ascii="Verdana" w:hAnsi="Verdana"/>
+          <w:lang w:val="ru-BY"/>
+        </w:rPr>
+      </w:pPr>
+      <w:r>
+        <w:rPr>
+          <w:rFonts w:ascii="Verdana" w:hAnsi="Verdana"/>
+          <w:lang w:val="ru-BY"/>
+        </w:rPr>
+        <w:lastRenderedPageBreak/>
+        <w:t xml:space="preserve">Some of the </w:t>
+      </w:r>
+      <w:r>
+        <w:rPr>
+          <w:rFonts w:ascii="Verdana" w:hAnsi="Verdana"/>
+          <w:lang w:val="ru-BY"/>
+        </w:rPr>
+        <w:t>IaC tools</w:t>
+      </w:r>
+      <w:r>
+        <w:rPr>
+          <w:rFonts w:ascii="Verdana" w:hAnsi="Verdana"/>
+          <w:lang w:val="ru-BY"/>
+        </w:rPr>
+        <w:t>:</w:t>
+      </w:r>
+    </w:p>
+    <w:p>
+      <w:pPr>
+        <w:pStyle w:val="ListParagraph"/>
+        <w:numPr>
+          <w:ilvl w:val="0"/>
+          <w:numId w:val="7"/>
+        </w:numPr>
+        <w:spacing w:before="100" w:beforeAutospacing="1" w:line="240" w:lineRule="auto"/>
+        <w:jc w:val="both"/>
+        <w:rPr>
+          <w:rFonts w:ascii="Verdana" w:hAnsi="Verdana"/>
+          <w:lang w:val="ru-BY"/>
+        </w:rPr>
+      </w:pPr>
+      <w:hyperlink r:id="rId10" w:history="1">
+        <w:r>
+          <w:rPr>
+            <w:rStyle w:val="Hyperlink"/>
+            <w:rFonts w:ascii="Verdana" w:hAnsi="Verdana"/>
+            <w:lang w:val="ru-BY"/>
+          </w:rPr>
+          <w:t>Azure Resource Manager templates</w:t>
+        </w:r>
+      </w:hyperlink>
+    </w:p>
+    <w:p>
+      <w:pPr>
+        <w:pStyle w:val="ListParagraph"/>
+        <w:numPr>
+          <w:ilvl w:val="0"/>
+          <w:numId w:val="7"/>
+        </w:numPr>
+        <w:spacing w:before="100" w:beforeAutospacing="1" w:line="240" w:lineRule="auto"/>
+        <w:jc w:val="both"/>
+        <w:rPr>
+          <w:rFonts w:ascii="Verdana" w:hAnsi="Verdana"/>
+          <w:lang w:val="ru-BY"/>
+        </w:rPr>
+      </w:pPr>
+      <w:hyperlink r:id="rId11" w:history="1">
+        <w:r>
+          <w:rPr>
+            <w:rStyle w:val="Hyperlink"/>
+            <w:rFonts w:ascii="Verdana" w:hAnsi="Verdana"/>
+            <w:lang w:val="ru-BY"/>
+          </w:rPr>
+          <w:t>Terraform</w:t>
+        </w:r>
+      </w:hyperlink>
+    </w:p>
+    <w:p>
+      <w:pPr>
+        <w:pStyle w:val="ListParagraph"/>
+        <w:numPr>
+          <w:ilvl w:val="0"/>
+          <w:numId w:val="7"/>
+        </w:numPr>
+        <w:spacing w:before="100" w:beforeAutospacing="1" w:line="240" w:lineRule="auto"/>
+        <w:jc w:val="both"/>
+        <w:rPr>
+          <w:rFonts w:ascii="Verdana" w:hAnsi="Verdana"/>
+          <w:lang w:val="ru-BY"/>
+        </w:rPr>
+      </w:pPr>
+      <w:hyperlink r:id="rId12" w:history="1">
+        <w:r>
+          <w:rPr>
+            <w:rStyle w:val="Hyperlink"/>
+            <w:rFonts w:ascii="Verdana" w:hAnsi="Verdana"/>
+            <w:lang w:val="ru-BY"/>
+          </w:rPr>
+          <w:t>Kubernetes YAML manifests</w:t>
+        </w:r>
+      </w:hyperlink>
+    </w:p>
+    <w:p>
+      <w:pPr>
+        <w:pStyle w:val="ListParagraph"/>
+        <w:numPr>
+          <w:ilvl w:val="0"/>
+          <w:numId w:val="7"/>
+        </w:numPr>
+        <w:spacing w:before="100" w:beforeAutospacing="1" w:line="240" w:lineRule="auto"/>
+        <w:jc w:val="both"/>
+        <w:rPr>
+          <w:rFonts w:ascii="Verdana" w:hAnsi="Verdana"/>
+          <w:lang w:val="ru-BY"/>
+        </w:rPr>
+      </w:pPr>
+      <w:hyperlink r:id="rId13" w:history="1">
+        <w:r>
+          <w:rPr>
+            <w:rStyle w:val="Hyperlink"/>
+            <w:rFonts w:ascii="Verdana" w:hAnsi="Verdana"/>
+            <w:lang w:val="ru-BY"/>
+          </w:rPr>
+          <w:t>Helm</w:t>
+        </w:r>
+      </w:hyperlink>
     </w:p>
     <w:p>
       <w:pPr>
@@ -736,16 +1865,31 @@
           <w:lang w:val="ru-BY"/>
         </w:rPr>
       </w:pPr>
-    </w:p>
-    <w:p>
-      <w:pPr>
-        <w:spacing w:before="100" w:beforeAutospacing="1" w:line="240" w:lineRule="auto"/>
-        <w:jc w:val="both"/>
-        <w:rPr>
-          <w:rFonts w:ascii="Verdana" w:hAnsi="Verdana"/>
-          <w:lang w:val="ru-BY"/>
-        </w:rPr>
-      </w:pPr>
+      <w:r>
+        <w:rPr>
+          <w:rFonts w:ascii="Verdana" w:hAnsi="Verdana"/>
+          <w:lang w:val="ru-BY"/>
+        </w:rPr>
+        <w:t>IaC can be integrated into CI/CD pipelines to automatically validate, plan, provision, update, and manage infrastructure.</w:t>
+      </w:r>
+    </w:p>
+    <w:p>
+      <w:pPr>
+        <w:spacing w:before="100" w:beforeAutospacing="1" w:line="240" w:lineRule="auto"/>
+        <w:ind w:left="360"/>
+        <w:jc w:val="both"/>
+        <w:rPr>
+          <w:rFonts w:ascii="Verdana" w:hAnsi="Verdana"/>
+          <w:lang w:val="ru-BY"/>
+        </w:rPr>
+      </w:pPr>
+      <w:r>
+        <w:rPr>
+          <w:rFonts w:ascii="Verdana" w:hAnsi="Verdana"/>
+          <w:lang w:val="ru-BY"/>
+        </w:rPr>
+        <w:t>In a typical pipeline, IaC files are stored in the same repository or a separate infrastructure repository. When changes are made, the pipeline can run formatting checks, validation, security scanning, and a “plan” step to show what infrastructure changes will be applied. After approval, the pipeline runs the “apply” step to create or update the target environment.</w:t>
+      </w:r>
     </w:p>
     <w:sectPr>
       <w:pgSz w:w="12240" w:h="15840"/>
@@ -758,8 +1902,436 @@
 </file>
 
 <file path=word/numbering.xml><?xml version="1.0" encoding="utf-8"?>
-<w:numbering xmlns:wpc="http://schemas.microsoft.com/office/word/2010/wordprocessingCanvas" xmlns:cx="http://schemas.microsoft.com/office/drawing/2014/chartex" xmlns:cx1="http://schemas.microsoft.com/office/drawing/2015/9/8/chartex" xmlns:cx2="http://schemas.microsoft.com/office/drawing/2015/10/21/chartex" xmlns:cx3="http://schemas.microsoft.com/office/drawing/2016/5/9/chartex" xmlns:cx4="http://schemas.microsoft.com/office/drawing/2016/5/10/chartex" xmlns:cx5="http://schemas.microsoft.com/office/drawing/2016/5/11/chartex" xmlns:cx6="http://schemas.microsoft.com/office/drawing/2016/5/12/chartex" xmlns:cx7="http://schemas.microsoft.com/office/drawing/2016/5/13/chartex" xmlns:cx8="http://schemas.microsoft.com/office/drawing/2016/5/14/chartex" xmlns:mc="http://schemas.openxmlformats.org/markup-compatibility/2006" xmlns:aink="http://schemas.microsoft.com/office/drawing/2016/ink" xmlns:am3d="http://schemas.microsoft.com/office/drawing/2017/model3d" xmlns:o="urn:schemas-microsoft-com:office:office" xmlns:oel="http://schemas.microsoft.com/office/2019/extlst" xmlns:r="http://schemas.openxmlformats.org/officeDocument/2006/relationships" xmlns:m="http://schemas.openxmlformats.org/officeDocument/2006/math" xmlns:v="urn:schemas-microsoft-com:vml" xmlns:wp14="http://schemas.microsoft.com/office/word/2010/wordprocessingDrawing" xmlns:wp="http://schemas.openxmlformats.org/drawingml/2006/wordprocessingDrawing" xmlns:w10="urn:schemas-microsoft-com:office:word" xmlns:w="http://schemas.openxmlformats.org/wordprocessingml/2006/main" xmlns:w14="http://schemas.microsoft.com/office/word/2010/wordml" xmlns:w15="http://schemas.microsoft.com/office/word/2012/wordml" xmlns:w16cex="http://schemas.microsoft.com/office/word/2018/wordml/cex" xmlns:w16cid="http://schemas.microsoft.com/office/word/2016/wordml/cid" xmlns:w16="http://schemas.microsoft.com/office/word/2018/wordml" xmlns:w16du="http://schemas.microsoft.com/office/word/2023/wordml/word16du" xmlns:w16sdtdh="http://schemas.microsoft.com/office/word/2020/wordml/sdtdatahash" xmlns:w16sdtfl="http://schemas.microsoft.com/office/word/2024/wordml/sdtformatlock" xmlns:w16se="http://schemas.microsoft.com/office/word/2015/wordml/symex" xmlns:wpg="http://schemas.microsoft.com/office/word/2010/wordprocessingGroup" xmlns:wpi="http://schemas.microsoft.com/office/word/2010/wordprocessingInk" xmlns:wne="http://schemas.microsoft.com/office/word/2006/wordml" xmlns:wps="http://schemas.microsoft.com/office/word/2010/wordprocessingShape" mc:Ignorable="w14 w15 w16se w16cid w16 w16cex w16sdtdh w16sdtfl w16du wp14">
+<w:numbering xmlns:wpc="http://schemas.microsoft.com/office/word/2010/wordprocessingCanvas" xmlns:cx="http://schemas.microsoft.com/office/drawing/2014/chartex" xmlns:cx1="http://schemas.microsoft.com/office/drawing/2015/9/8/chartex" xmlns:cx2="http://schemas.microsoft.com/office/drawing/2015/10/21/chartex" xmlns:cx3="http://schemas.microsoft.com/office/drawing/2016/5/9/chartex" xmlns:cx4="http://schemas.microsoft.com/office/drawing/2016/5/10/chartex" xmlns:cx5="http://schemas.microsoft.com/office/drawing/2016/5/11/chartex" xmlns:cx6="http://schemas.microsoft.com/office/drawing/2016/5/12/chartex" xmlns:cx7="http://schemas.microsoft.com/office/drawing/2016/5/13/chartex" xmlns:cx8="http://schemas.microsoft.com/office/drawing/2016/5/14/chartex" xmlns:mc="http://schemas.openxmlformats.org/markup-compatibility/2006" xmlns:aink="http://schemas.microsoft.com/office/drawing/2016/ink" xmlns:am3d="http://schemas.microsoft.com/office/drawing/2017/model3d" xmlns:o="urn:schemas-microsoft-com:office:office" xmlns:oel="http://schemas.microsoft.com/office/2019/extlst" xmlns:r="http://schemas.openxmlformats.org/officeDocument/2006/relationships" xmlns:m="http://schemas.openxmlformats.org/officeDocument/2006/math" xmlns:v="urn:schemas-microsoft-com:vml" xmlns:wp14="http://schemas.microsoft.com/office/word/2010/wordprocessingDrawing" xmlns:wp="http://schemas.openxmlformats.org/drawingml/2006/wordprocessingDrawing" xmlns:w10="urn:schemas-microsoft-com:office:word" xmlns:w="http://schemas.openxmlformats.org/wordprocessingml/2006/main" xmlns:w14="http://schemas.microsoft.com/office/word/2010/wordml" xmlns:w15="http://schemas.microsoft.com/office/word/2012/wordml" xmlns:w16cei="http://schemas.microsoft.com/office/word/2026/wordml/cei" xmlns:w16cex="http://schemas.microsoft.com/office/word/2018/wordml/cex" xmlns:w16cid="http://schemas.microsoft.com/office/word/2016/wordml/cid" xmlns:w16="http://schemas.microsoft.com/office/word/2018/wordml" xmlns:w16du="http://schemas.microsoft.com/office/word/2023/wordml/word16du" xmlns:w16sdtdh="http://schemas.microsoft.com/office/word/2020/wordml/sdtdatahash" xmlns:w16sdtfl="http://schemas.microsoft.com/office/word/2024/wordml/sdtformatlock" xmlns:w16se="http://schemas.microsoft.com/office/word/2015/wordml/symex" xmlns:wpg="http://schemas.microsoft.com/office/word/2010/wordprocessingGroup" xmlns:wpi="http://schemas.microsoft.com/office/word/2010/wordprocessingInk" xmlns:wne="http://schemas.microsoft.com/office/word/2006/wordml" xmlns:wps="http://schemas.microsoft.com/office/word/2010/wordprocessingShape" mc:Ignorable="w14 w15 w16se w16cid w16 w16cex w16sdtdh w16sdtfl w16du wp14">
   <w:abstractNum w:abstractNumId="0" w15:restartNumberingAfterBreak="0">
+    <w:nsid w:val="016946FE"/>
+    <w:multiLevelType w:val="hybridMultilevel"/>
+    <w:tmpl w:val="86EEB72C"/>
+    <w:lvl w:ilvl="0" w:tplc="0C00000F">
+      <w:start w:val="1"/>
+      <w:numFmt w:val="decimal"/>
+      <w:lvlText w:val="%1."/>
+      <w:lvlJc w:val="left"/>
+      <w:pPr>
+        <w:ind w:left="720" w:hanging="360"/>
+      </w:pPr>
+      <w:rPr>
+        <w:rFonts w:hint="default"/>
+      </w:rPr>
+    </w:lvl>
+    <w:lvl w:ilvl="1" w:tplc="0C000019" w:tentative="1">
+      <w:start w:val="1"/>
+      <w:numFmt w:val="lowerLetter"/>
+      <w:lvlText w:val="%2."/>
+      <w:lvlJc w:val="left"/>
+      <w:pPr>
+        <w:ind w:left="1440" w:hanging="360"/>
+      </w:pPr>
+    </w:lvl>
+    <w:lvl w:ilvl="2" w:tplc="0C00001B" w:tentative="1">
+      <w:start w:val="1"/>
+      <w:numFmt w:val="lowerRoman"/>
+      <w:lvlText w:val="%3."/>
+      <w:lvlJc w:val="right"/>
+      <w:pPr>
+        <w:ind w:left="2160" w:hanging="180"/>
+      </w:pPr>
+    </w:lvl>
+    <w:lvl w:ilvl="3" w:tplc="0C00000F" w:tentative="1">
+      <w:start w:val="1"/>
+      <w:numFmt w:val="decimal"/>
+      <w:lvlText w:val="%4."/>
+      <w:lvlJc w:val="left"/>
+      <w:pPr>
+        <w:ind w:left="2880" w:hanging="360"/>
+      </w:pPr>
+    </w:lvl>
+    <w:lvl w:ilvl="4" w:tplc="0C000019" w:tentative="1">
+      <w:start w:val="1"/>
+      <w:numFmt w:val="lowerLetter"/>
+      <w:lvlText w:val="%5."/>
+      <w:lvlJc w:val="left"/>
+      <w:pPr>
+        <w:ind w:left="3600" w:hanging="360"/>
+      </w:pPr>
+    </w:lvl>
+    <w:lvl w:ilvl="5" w:tplc="0C00001B" w:tentative="1">
+      <w:start w:val="1"/>
+      <w:numFmt w:val="lowerRoman"/>
+      <w:lvlText w:val="%6."/>
+      <w:lvlJc w:val="right"/>
+      <w:pPr>
+        <w:ind w:left="4320" w:hanging="180"/>
+      </w:pPr>
+    </w:lvl>
+    <w:lvl w:ilvl="6" w:tplc="0C00000F" w:tentative="1">
+      <w:start w:val="1"/>
+      <w:numFmt w:val="decimal"/>
+      <w:lvlText w:val="%7."/>
+      <w:lvlJc w:val="left"/>
+      <w:pPr>
+        <w:ind w:left="5040" w:hanging="360"/>
+      </w:pPr>
+    </w:lvl>
+    <w:lvl w:ilvl="7" w:tplc="0C000019" w:tentative="1">
+      <w:start w:val="1"/>
+      <w:numFmt w:val="lowerLetter"/>
+      <w:lvlText w:val="%8."/>
+      <w:lvlJc w:val="left"/>
+      <w:pPr>
+        <w:ind w:left="5760" w:hanging="360"/>
+      </w:pPr>
+    </w:lvl>
+    <w:lvl w:ilvl="8" w:tplc="0C00001B" w:tentative="1">
+      <w:start w:val="1"/>
+      <w:numFmt w:val="lowerRoman"/>
+      <w:lvlText w:val="%9."/>
+      <w:lvlJc w:val="right"/>
+      <w:pPr>
+        <w:ind w:left="6480" w:hanging="180"/>
+      </w:pPr>
+    </w:lvl>
+  </w:abstractNum>
+  <w:abstractNum w:abstractNumId="1" w15:restartNumberingAfterBreak="0">
+    <w:nsid w:val="243C3B7F"/>
+    <w:multiLevelType w:val="hybridMultilevel"/>
+    <w:tmpl w:val="76D67E18"/>
+    <w:lvl w:ilvl="0" w:tplc="0C000001">
+      <w:start w:val="1"/>
+      <w:numFmt w:val="bullet"/>
+      <w:lvlText w:val=""/>
+      <w:lvlJc w:val="left"/>
+      <w:pPr>
+        <w:ind w:left="1080" w:hanging="360"/>
+      </w:pPr>
+      <w:rPr>
+        <w:rFonts w:ascii="Symbol" w:hAnsi="Symbol" w:hint="default"/>
+      </w:rPr>
+    </w:lvl>
+    <w:lvl w:ilvl="1" w:tplc="0C000003" w:tentative="1">
+      <w:start w:val="1"/>
+      <w:numFmt w:val="bullet"/>
+      <w:lvlText w:val="o"/>
+      <w:lvlJc w:val="left"/>
+      <w:pPr>
+        <w:ind w:left="1800" w:hanging="360"/>
+      </w:pPr>
+      <w:rPr>
+        <w:rFonts w:ascii="Courier New" w:hAnsi="Courier New" w:cs="Courier New" w:hint="default"/>
+      </w:rPr>
+    </w:lvl>
+    <w:lvl w:ilvl="2" w:tplc="0C000005" w:tentative="1">
+      <w:start w:val="1"/>
+      <w:numFmt w:val="bullet"/>
+      <w:lvlText w:val=""/>
+      <w:lvlJc w:val="left"/>
+      <w:pPr>
+        <w:ind w:left="2520" w:hanging="360"/>
+      </w:pPr>
+      <w:rPr>
+        <w:rFonts w:ascii="Wingdings" w:hAnsi="Wingdings" w:hint="default"/>
+      </w:rPr>
+    </w:lvl>
+    <w:lvl w:ilvl="3" w:tplc="0C000001" w:tentative="1">
+      <w:start w:val="1"/>
+      <w:numFmt w:val="bullet"/>
+      <w:lvlText w:val=""/>
+      <w:lvlJc w:val="left"/>
+      <w:pPr>
+        <w:ind w:left="3240" w:hanging="360"/>
+      </w:pPr>
+      <w:rPr>
+        <w:rFonts w:ascii="Symbol" w:hAnsi="Symbol" w:hint="default"/>
+      </w:rPr>
+    </w:lvl>
+    <w:lvl w:ilvl="4" w:tplc="0C000003" w:tentative="1">
+      <w:start w:val="1"/>
+      <w:numFmt w:val="bullet"/>
+      <w:lvlText w:val="o"/>
+      <w:lvlJc w:val="left"/>
+      <w:pPr>
+        <w:ind w:left="3960" w:hanging="360"/>
+      </w:pPr>
+      <w:rPr>
+        <w:rFonts w:ascii="Courier New" w:hAnsi="Courier New" w:cs="Courier New" w:hint="default"/>
+      </w:rPr>
+    </w:lvl>
+    <w:lvl w:ilvl="5" w:tplc="0C000005" w:tentative="1">
+      <w:start w:val="1"/>
+      <w:numFmt w:val="bullet"/>
+      <w:lvlText w:val=""/>
+      <w:lvlJc w:val="left"/>
+      <w:pPr>
+        <w:ind w:left="4680" w:hanging="360"/>
+      </w:pPr>
+      <w:rPr>
+        <w:rFonts w:ascii="Wingdings" w:hAnsi="Wingdings" w:hint="default"/>
+      </w:rPr>
+    </w:lvl>
+    <w:lvl w:ilvl="6" w:tplc="0C000001" w:tentative="1">
+      <w:start w:val="1"/>
+      <w:numFmt w:val="bullet"/>
+      <w:lvlText w:val=""/>
+      <w:lvlJc w:val="left"/>
+      <w:pPr>
+        <w:ind w:left="5400" w:hanging="360"/>
+      </w:pPr>
+      <w:rPr>
+        <w:rFonts w:ascii="Symbol" w:hAnsi="Symbol" w:hint="default"/>
+      </w:rPr>
+    </w:lvl>
+    <w:lvl w:ilvl="7" w:tplc="0C000003" w:tentative="1">
+      <w:start w:val="1"/>
+      <w:numFmt w:val="bullet"/>
+      <w:lvlText w:val="o"/>
+      <w:lvlJc w:val="left"/>
+      <w:pPr>
+        <w:ind w:left="6120" w:hanging="360"/>
+      </w:pPr>
+      <w:rPr>
+        <w:rFonts w:ascii="Courier New" w:hAnsi="Courier New" w:cs="Courier New" w:hint="default"/>
+      </w:rPr>
+    </w:lvl>
+    <w:lvl w:ilvl="8" w:tplc="0C000005" w:tentative="1">
+      <w:start w:val="1"/>
+      <w:numFmt w:val="bullet"/>
+      <w:lvlText w:val=""/>
+      <w:lvlJc w:val="left"/>
+      <w:pPr>
+        <w:ind w:left="6840" w:hanging="360"/>
+      </w:pPr>
+      <w:rPr>
+        <w:rFonts w:ascii="Wingdings" w:hAnsi="Wingdings" w:hint="default"/>
+      </w:rPr>
+    </w:lvl>
+  </w:abstractNum>
+  <w:abstractNum w:abstractNumId="2" w15:restartNumberingAfterBreak="0">
+    <w:nsid w:val="26D4521F"/>
+    <w:multiLevelType w:val="hybridMultilevel"/>
+    <w:tmpl w:val="48EE553C"/>
+    <w:lvl w:ilvl="0" w:tplc="0C000001">
+      <w:start w:val="1"/>
+      <w:numFmt w:val="bullet"/>
+      <w:lvlText w:val=""/>
+      <w:lvlJc w:val="left"/>
+      <w:pPr>
+        <w:ind w:left="1080" w:hanging="360"/>
+      </w:pPr>
+      <w:rPr>
+        <w:rFonts w:ascii="Symbol" w:hAnsi="Symbol" w:hint="default"/>
+      </w:rPr>
+    </w:lvl>
+    <w:lvl w:ilvl="1" w:tplc="0C000003" w:tentative="1">
+      <w:start w:val="1"/>
+      <w:numFmt w:val="bullet"/>
+      <w:lvlText w:val="o"/>
+      <w:lvlJc w:val="left"/>
+      <w:pPr>
+        <w:ind w:left="1800" w:hanging="360"/>
+      </w:pPr>
+      <w:rPr>
+        <w:rFonts w:ascii="Courier New" w:hAnsi="Courier New" w:cs="Courier New" w:hint="default"/>
+      </w:rPr>
+    </w:lvl>
+    <w:lvl w:ilvl="2" w:tplc="0C000005" w:tentative="1">
+      <w:start w:val="1"/>
+      <w:numFmt w:val="bullet"/>
+      <w:lvlText w:val=""/>
+      <w:lvlJc w:val="left"/>
+      <w:pPr>
+        <w:ind w:left="2520" w:hanging="360"/>
+      </w:pPr>
+      <w:rPr>
+        <w:rFonts w:ascii="Wingdings" w:hAnsi="Wingdings" w:hint="default"/>
+      </w:rPr>
+    </w:lvl>
+    <w:lvl w:ilvl="3" w:tplc="0C000001" w:tentative="1">
+      <w:start w:val="1"/>
+      <w:numFmt w:val="bullet"/>
+      <w:lvlText w:val=""/>
+      <w:lvlJc w:val="left"/>
+      <w:pPr>
+        <w:ind w:left="3240" w:hanging="360"/>
+      </w:pPr>
+      <w:rPr>
+        <w:rFonts w:ascii="Symbol" w:hAnsi="Symbol" w:hint="default"/>
+      </w:rPr>
+    </w:lvl>
+    <w:lvl w:ilvl="4" w:tplc="0C000003" w:tentative="1">
+      <w:start w:val="1"/>
+      <w:numFmt w:val="bullet"/>
+      <w:lvlText w:val="o"/>
+      <w:lvlJc w:val="left"/>
+      <w:pPr>
+        <w:ind w:left="3960" w:hanging="360"/>
+      </w:pPr>
+      <w:rPr>
+        <w:rFonts w:ascii="Courier New" w:hAnsi="Courier New" w:cs="Courier New" w:hint="default"/>
+      </w:rPr>
+    </w:lvl>
+    <w:lvl w:ilvl="5" w:tplc="0C000005" w:tentative="1">
+      <w:start w:val="1"/>
+      <w:numFmt w:val="bullet"/>
+      <w:lvlText w:val=""/>
+      <w:lvlJc w:val="left"/>
+      <w:pPr>
+        <w:ind w:left="4680" w:hanging="360"/>
+      </w:pPr>
+      <w:rPr>
+        <w:rFonts w:ascii="Wingdings" w:hAnsi="Wingdings" w:hint="default"/>
+      </w:rPr>
+    </w:lvl>
+    <w:lvl w:ilvl="6" w:tplc="0C000001" w:tentative="1">
+      <w:start w:val="1"/>
+      <w:numFmt w:val="bullet"/>
+      <w:lvlText w:val=""/>
+      <w:lvlJc w:val="left"/>
+      <w:pPr>
+        <w:ind w:left="5400" w:hanging="360"/>
+      </w:pPr>
+      <w:rPr>
+        <w:rFonts w:ascii="Symbol" w:hAnsi="Symbol" w:hint="default"/>
+      </w:rPr>
+    </w:lvl>
+    <w:lvl w:ilvl="7" w:tplc="0C000003" w:tentative="1">
+      <w:start w:val="1"/>
+      <w:numFmt w:val="bullet"/>
+      <w:lvlText w:val="o"/>
+      <w:lvlJc w:val="left"/>
+      <w:pPr>
+        <w:ind w:left="6120" w:hanging="360"/>
+      </w:pPr>
+      <w:rPr>
+        <w:rFonts w:ascii="Courier New" w:hAnsi="Courier New" w:cs="Courier New" w:hint="default"/>
+      </w:rPr>
+    </w:lvl>
+    <w:lvl w:ilvl="8" w:tplc="0C000005" w:tentative="1">
+      <w:start w:val="1"/>
+      <w:numFmt w:val="bullet"/>
+      <w:lvlText w:val=""/>
+      <w:lvlJc w:val="left"/>
+      <w:pPr>
+        <w:ind w:left="6840" w:hanging="360"/>
+      </w:pPr>
+      <w:rPr>
+        <w:rFonts w:ascii="Wingdings" w:hAnsi="Wingdings" w:hint="default"/>
+      </w:rPr>
+    </w:lvl>
+  </w:abstractNum>
+  <w:abstractNum w:abstractNumId="3" w15:restartNumberingAfterBreak="0">
+    <w:nsid w:val="2C4476E2"/>
+    <w:multiLevelType w:val="hybridMultilevel"/>
+    <w:tmpl w:val="11147FB2"/>
+    <w:lvl w:ilvl="0" w:tplc="0C000001">
+      <w:start w:val="1"/>
+      <w:numFmt w:val="bullet"/>
+      <w:lvlText w:val=""/>
+      <w:lvlJc w:val="left"/>
+      <w:pPr>
+        <w:ind w:left="1080" w:hanging="360"/>
+      </w:pPr>
+      <w:rPr>
+        <w:rFonts w:ascii="Symbol" w:hAnsi="Symbol" w:hint="default"/>
+      </w:rPr>
+    </w:lvl>
+    <w:lvl w:ilvl="1" w:tplc="0C000003" w:tentative="1">
+      <w:start w:val="1"/>
+      <w:numFmt w:val="bullet"/>
+      <w:lvlText w:val="o"/>
+      <w:lvlJc w:val="left"/>
+      <w:pPr>
+        <w:ind w:left="1800" w:hanging="360"/>
+      </w:pPr>
+      <w:rPr>
+        <w:rFonts w:ascii="Courier New" w:hAnsi="Courier New" w:cs="Courier New" w:hint="default"/>
+      </w:rPr>
+    </w:lvl>
+    <w:lvl w:ilvl="2" w:tplc="0C000005" w:tentative="1">
+      <w:start w:val="1"/>
+      <w:numFmt w:val="bullet"/>
+      <w:lvlText w:val=""/>
+      <w:lvlJc w:val="left"/>
+      <w:pPr>
+        <w:ind w:left="2520" w:hanging="360"/>
+      </w:pPr>
+      <w:rPr>
+        <w:rFonts w:ascii="Wingdings" w:hAnsi="Wingdings" w:hint="default"/>
+      </w:rPr>
+    </w:lvl>
+    <w:lvl w:ilvl="3" w:tplc="0C000001" w:tentative="1">
+      <w:start w:val="1"/>
+      <w:numFmt w:val="bullet"/>
+      <w:lvlText w:val=""/>
+      <w:lvlJc w:val="left"/>
+      <w:pPr>
+        <w:ind w:left="3240" w:hanging="360"/>
+      </w:pPr>
+      <w:rPr>
+        <w:rFonts w:ascii="Symbol" w:hAnsi="Symbol" w:hint="default"/>
+      </w:rPr>
+    </w:lvl>
+    <w:lvl w:ilvl="4" w:tplc="0C000003" w:tentative="1">
+      <w:start w:val="1"/>
+      <w:numFmt w:val="bullet"/>
+      <w:lvlText w:val="o"/>
+      <w:lvlJc w:val="left"/>
+      <w:pPr>
+        <w:ind w:left="3960" w:hanging="360"/>
+      </w:pPr>
+      <w:rPr>
+        <w:rFonts w:ascii="Courier New" w:hAnsi="Courier New" w:cs="Courier New" w:hint="default"/>
+      </w:rPr>
+    </w:lvl>
+    <w:lvl w:ilvl="5" w:tplc="0C000005" w:tentative="1">
+      <w:start w:val="1"/>
+      <w:numFmt w:val="bullet"/>
+      <w:lvlText w:val=""/>
+      <w:lvlJc w:val="left"/>
+      <w:pPr>
+        <w:ind w:left="4680" w:hanging="360"/>
+      </w:pPr>
+      <w:rPr>
+        <w:rFonts w:ascii="Wingdings" w:hAnsi="Wingdings" w:hint="default"/>
+      </w:rPr>
+    </w:lvl>
+    <w:lvl w:ilvl="6" w:tplc="0C000001" w:tentative="1">
+      <w:start w:val="1"/>
+      <w:numFmt w:val="bullet"/>
+      <w:lvlText w:val=""/>
+      <w:lvlJc w:val="left"/>
+      <w:pPr>
+        <w:ind w:left="5400" w:hanging="360"/>
+      </w:pPr>
+      <w:rPr>
+        <w:rFonts w:ascii="Symbol" w:hAnsi="Symbol" w:hint="default"/>
+      </w:rPr>
+    </w:lvl>
+    <w:lvl w:ilvl="7" w:tplc="0C000003" w:tentative="1">
+      <w:start w:val="1"/>
+      <w:numFmt w:val="bullet"/>
+      <w:lvlText w:val="o"/>
+      <w:lvlJc w:val="left"/>
+      <w:pPr>
+        <w:ind w:left="6120" w:hanging="360"/>
+      </w:pPr>
+      <w:rPr>
+        <w:rFonts w:ascii="Courier New" w:hAnsi="Courier New" w:cs="Courier New" w:hint="default"/>
+      </w:rPr>
+    </w:lvl>
+    <w:lvl w:ilvl="8" w:tplc="0C000005" w:tentative="1">
+      <w:start w:val="1"/>
+      <w:numFmt w:val="bullet"/>
+      <w:lvlText w:val=""/>
+      <w:lvlJc w:val="left"/>
+      <w:pPr>
+        <w:ind w:left="6840" w:hanging="360"/>
+      </w:pPr>
+      <w:rPr>
+        <w:rFonts w:ascii="Wingdings" w:hAnsi="Wingdings" w:hint="default"/>
+      </w:rPr>
+    </w:lvl>
+  </w:abstractNum>
+  <w:abstractNum w:abstractNumId="4" w15:restartNumberingAfterBreak="0">
     <w:nsid w:val="361458B8"/>
     <w:multiLevelType w:val="multilevel"/>
     <w:tmpl w:val="A50A17CE"/>
@@ -872,7 +2444,120 @@
       </w:pPr>
     </w:lvl>
   </w:abstractNum>
-  <w:abstractNum w:abstractNumId="1" w15:restartNumberingAfterBreak="0">
+  <w:abstractNum w:abstractNumId="5" w15:restartNumberingAfterBreak="0">
+    <w:nsid w:val="37AD28B9"/>
+    <w:multiLevelType w:val="hybridMultilevel"/>
+    <w:tmpl w:val="024C5E7C"/>
+    <w:lvl w:ilvl="0" w:tplc="0C000001">
+      <w:start w:val="1"/>
+      <w:numFmt w:val="bullet"/>
+      <w:lvlText w:val=""/>
+      <w:lvlJc w:val="left"/>
+      <w:pPr>
+        <w:ind w:left="1080" w:hanging="360"/>
+      </w:pPr>
+      <w:rPr>
+        <w:rFonts w:ascii="Symbol" w:hAnsi="Symbol" w:hint="default"/>
+      </w:rPr>
+    </w:lvl>
+    <w:lvl w:ilvl="1" w:tplc="0C000003" w:tentative="1">
+      <w:start w:val="1"/>
+      <w:numFmt w:val="bullet"/>
+      <w:lvlText w:val="o"/>
+      <w:lvlJc w:val="left"/>
+      <w:pPr>
+        <w:ind w:left="1800" w:hanging="360"/>
+      </w:pPr>
+      <w:rPr>
+        <w:rFonts w:ascii="Courier New" w:hAnsi="Courier New" w:cs="Courier New" w:hint="default"/>
+      </w:rPr>
+    </w:lvl>
+    <w:lvl w:ilvl="2" w:tplc="0C000005" w:tentative="1">
+      <w:start w:val="1"/>
+      <w:numFmt w:val="bullet"/>
+      <w:lvlText w:val=""/>
+      <w:lvlJc w:val="left"/>
+      <w:pPr>
+        <w:ind w:left="2520" w:hanging="360"/>
+      </w:pPr>
+      <w:rPr>
+        <w:rFonts w:ascii="Wingdings" w:hAnsi="Wingdings" w:hint="default"/>
+      </w:rPr>
+    </w:lvl>
+    <w:lvl w:ilvl="3" w:tplc="0C000001" w:tentative="1">
+      <w:start w:val="1"/>
+      <w:numFmt w:val="bullet"/>
+      <w:lvlText w:val=""/>
+      <w:lvlJc w:val="left"/>
+      <w:pPr>
+        <w:ind w:left="3240" w:hanging="360"/>
+      </w:pPr>
+      <w:rPr>
+        <w:rFonts w:ascii="Symbol" w:hAnsi="Symbol" w:hint="default"/>
+      </w:rPr>
+    </w:lvl>
+    <w:lvl w:ilvl="4" w:tplc="0C000003" w:tentative="1">
+      <w:start w:val="1"/>
+      <w:numFmt w:val="bullet"/>
+      <w:lvlText w:val="o"/>
+      <w:lvlJc w:val="left"/>
+      <w:pPr>
+        <w:ind w:left="3960" w:hanging="360"/>
+      </w:pPr>
+      <w:rPr>
+        <w:rFonts w:ascii="Courier New" w:hAnsi="Courier New" w:cs="Courier New" w:hint="default"/>
+      </w:rPr>
+    </w:lvl>
+    <w:lvl w:ilvl="5" w:tplc="0C000005" w:tentative="1">
+      <w:start w:val="1"/>
+      <w:numFmt w:val="bullet"/>
+      <w:lvlText w:val=""/>
+      <w:lvlJc w:val="left"/>
+      <w:pPr>
+        <w:ind w:left="4680" w:hanging="360"/>
+      </w:pPr>
+      <w:rPr>
+        <w:rFonts w:ascii="Wingdings" w:hAnsi="Wingdings" w:hint="default"/>
+      </w:rPr>
+    </w:lvl>
+    <w:lvl w:ilvl="6" w:tplc="0C000001" w:tentative="1">
+      <w:start w:val="1"/>
+      <w:numFmt w:val="bullet"/>
+      <w:lvlText w:val=""/>
+      <w:lvlJc w:val="left"/>
+      <w:pPr>
+        <w:ind w:left="5400" w:hanging="360"/>
+      </w:pPr>
+      <w:rPr>
+        <w:rFonts w:ascii="Symbol" w:hAnsi="Symbol" w:hint="default"/>
+      </w:rPr>
+    </w:lvl>
+    <w:lvl w:ilvl="7" w:tplc="0C000003" w:tentative="1">
+      <w:start w:val="1"/>
+      <w:numFmt w:val="bullet"/>
+      <w:lvlText w:val="o"/>
+      <w:lvlJc w:val="left"/>
+      <w:pPr>
+        <w:ind w:left="6120" w:hanging="360"/>
+      </w:pPr>
+      <w:rPr>
+        <w:rFonts w:ascii="Courier New" w:hAnsi="Courier New" w:cs="Courier New" w:hint="default"/>
+      </w:rPr>
+    </w:lvl>
+    <w:lvl w:ilvl="8" w:tplc="0C000005" w:tentative="1">
+      <w:start w:val="1"/>
+      <w:numFmt w:val="bullet"/>
+      <w:lvlText w:val=""/>
+      <w:lvlJc w:val="left"/>
+      <w:pPr>
+        <w:ind w:left="6840" w:hanging="360"/>
+      </w:pPr>
+      <w:rPr>
+        <w:rFonts w:ascii="Wingdings" w:hAnsi="Wingdings" w:hint="default"/>
+      </w:rPr>
+    </w:lvl>
+  </w:abstractNum>
+  <w:abstractNum w:abstractNumId="6" w15:restartNumberingAfterBreak="0">
     <w:nsid w:val="3B655C3C"/>
     <w:multiLevelType w:val="hybridMultilevel"/>
     <w:tmpl w:val="6DA267E2"/>
@@ -958,7 +2643,7 @@
       </w:pPr>
     </w:lvl>
   </w:abstractNum>
-  <w:abstractNum w:abstractNumId="2" w15:restartNumberingAfterBreak="0">
+  <w:abstractNum w:abstractNumId="7" w15:restartNumberingAfterBreak="0">
     <w:nsid w:val="3CDF7989"/>
     <w:multiLevelType w:val="hybridMultilevel"/>
     <w:tmpl w:val="BC268BB2"/>
@@ -1044,13 +2729,260 @@
       </w:pPr>
     </w:lvl>
   </w:abstractNum>
+  <w:abstractNum w:abstractNumId="8" w15:restartNumberingAfterBreak="0">
+    <w:nsid w:val="417D218A"/>
+    <w:multiLevelType w:val="hybridMultilevel"/>
+    <w:tmpl w:val="D17AE594"/>
+    <w:lvl w:ilvl="0" w:tplc="0C000001">
+      <w:start w:val="1"/>
+      <w:numFmt w:val="bullet"/>
+      <w:lvlText w:val=""/>
+      <w:lvlJc w:val="left"/>
+      <w:pPr>
+        <w:ind w:left="1080" w:hanging="360"/>
+      </w:pPr>
+      <w:rPr>
+        <w:rFonts w:ascii="Symbol" w:hAnsi="Symbol" w:hint="default"/>
+      </w:rPr>
+    </w:lvl>
+    <w:lvl w:ilvl="1" w:tplc="0C000003" w:tentative="1">
+      <w:start w:val="1"/>
+      <w:numFmt w:val="bullet"/>
+      <w:lvlText w:val="o"/>
+      <w:lvlJc w:val="left"/>
+      <w:pPr>
+        <w:ind w:left="1800" w:hanging="360"/>
+      </w:pPr>
+      <w:rPr>
+        <w:rFonts w:ascii="Courier New" w:hAnsi="Courier New" w:cs="Courier New" w:hint="default"/>
+      </w:rPr>
+    </w:lvl>
+    <w:lvl w:ilvl="2" w:tplc="0C000005" w:tentative="1">
+      <w:start w:val="1"/>
+      <w:numFmt w:val="bullet"/>
+      <w:lvlText w:val=""/>
+      <w:lvlJc w:val="left"/>
+      <w:pPr>
+        <w:ind w:left="2520" w:hanging="360"/>
+      </w:pPr>
+      <w:rPr>
+        <w:rFonts w:ascii="Wingdings" w:hAnsi="Wingdings" w:hint="default"/>
+      </w:rPr>
+    </w:lvl>
+    <w:lvl w:ilvl="3" w:tplc="0C000001" w:tentative="1">
+      <w:start w:val="1"/>
+      <w:numFmt w:val="bullet"/>
+      <w:lvlText w:val=""/>
+      <w:lvlJc w:val="left"/>
+      <w:pPr>
+        <w:ind w:left="3240" w:hanging="360"/>
+      </w:pPr>
+      <w:rPr>
+        <w:rFonts w:ascii="Symbol" w:hAnsi="Symbol" w:hint="default"/>
+      </w:rPr>
+    </w:lvl>
+    <w:lvl w:ilvl="4" w:tplc="0C000003" w:tentative="1">
+      <w:start w:val="1"/>
+      <w:numFmt w:val="bullet"/>
+      <w:lvlText w:val="o"/>
+      <w:lvlJc w:val="left"/>
+      <w:pPr>
+        <w:ind w:left="3960" w:hanging="360"/>
+      </w:pPr>
+      <w:rPr>
+        <w:rFonts w:ascii="Courier New" w:hAnsi="Courier New" w:cs="Courier New" w:hint="default"/>
+      </w:rPr>
+    </w:lvl>
+    <w:lvl w:ilvl="5" w:tplc="0C000005" w:tentative="1">
+      <w:start w:val="1"/>
+      <w:numFmt w:val="bullet"/>
+      <w:lvlText w:val=""/>
+      <w:lvlJc w:val="left"/>
+      <w:pPr>
+        <w:ind w:left="4680" w:hanging="360"/>
+      </w:pPr>
+      <w:rPr>
+        <w:rFonts w:ascii="Wingdings" w:hAnsi="Wingdings" w:hint="default"/>
+      </w:rPr>
+    </w:lvl>
+    <w:lvl w:ilvl="6" w:tplc="0C000001" w:tentative="1">
+      <w:start w:val="1"/>
+      <w:numFmt w:val="bullet"/>
+      <w:lvlText w:val=""/>
+      <w:lvlJc w:val="left"/>
+      <w:pPr>
+        <w:ind w:left="5400" w:hanging="360"/>
+      </w:pPr>
+      <w:rPr>
+        <w:rFonts w:ascii="Symbol" w:hAnsi="Symbol" w:hint="default"/>
+      </w:rPr>
+    </w:lvl>
+    <w:lvl w:ilvl="7" w:tplc="0C000003" w:tentative="1">
+      <w:start w:val="1"/>
+      <w:numFmt w:val="bullet"/>
+      <w:lvlText w:val="o"/>
+      <w:lvlJc w:val="left"/>
+      <w:pPr>
+        <w:ind w:left="6120" w:hanging="360"/>
+      </w:pPr>
+      <w:rPr>
+        <w:rFonts w:ascii="Courier New" w:hAnsi="Courier New" w:cs="Courier New" w:hint="default"/>
+      </w:rPr>
+    </w:lvl>
+    <w:lvl w:ilvl="8" w:tplc="0C000005" w:tentative="1">
+      <w:start w:val="1"/>
+      <w:numFmt w:val="bullet"/>
+      <w:lvlText w:val=""/>
+      <w:lvlJc w:val="left"/>
+      <w:pPr>
+        <w:ind w:left="6840" w:hanging="360"/>
+      </w:pPr>
+      <w:rPr>
+        <w:rFonts w:ascii="Wingdings" w:hAnsi="Wingdings" w:hint="default"/>
+      </w:rPr>
+    </w:lvl>
+  </w:abstractNum>
+  <w:abstractNum w:abstractNumId="9" w15:restartNumberingAfterBreak="0">
+    <w:nsid w:val="77262FB3"/>
+    <w:multiLevelType w:val="hybridMultilevel"/>
+    <w:tmpl w:val="42D438B0"/>
+    <w:lvl w:ilvl="0" w:tplc="0C000001">
+      <w:start w:val="1"/>
+      <w:numFmt w:val="bullet"/>
+      <w:lvlText w:val=""/>
+      <w:lvlJc w:val="left"/>
+      <w:pPr>
+        <w:ind w:left="1080" w:hanging="360"/>
+      </w:pPr>
+      <w:rPr>
+        <w:rFonts w:ascii="Symbol" w:hAnsi="Symbol" w:hint="default"/>
+      </w:rPr>
+    </w:lvl>
+    <w:lvl w:ilvl="1" w:tplc="0C000003" w:tentative="1">
+      <w:start w:val="1"/>
+      <w:numFmt w:val="bullet"/>
+      <w:lvlText w:val="o"/>
+      <w:lvlJc w:val="left"/>
+      <w:pPr>
+        <w:ind w:left="1800" w:hanging="360"/>
+      </w:pPr>
+      <w:rPr>
+        <w:rFonts w:ascii="Courier New" w:hAnsi="Courier New" w:cs="Courier New" w:hint="default"/>
+      </w:rPr>
+    </w:lvl>
+    <w:lvl w:ilvl="2" w:tplc="0C000005" w:tentative="1">
+      <w:start w:val="1"/>
+      <w:numFmt w:val="bullet"/>
+      <w:lvlText w:val=""/>
+      <w:lvlJc w:val="left"/>
+      <w:pPr>
+        <w:ind w:left="2520" w:hanging="360"/>
+      </w:pPr>
+      <w:rPr>
+        <w:rFonts w:ascii="Wingdings" w:hAnsi="Wingdings" w:hint="default"/>
+      </w:rPr>
+    </w:lvl>
+    <w:lvl w:ilvl="3" w:tplc="0C000001" w:tentative="1">
+      <w:start w:val="1"/>
+      <w:numFmt w:val="bullet"/>
+      <w:lvlText w:val=""/>
+      <w:lvlJc w:val="left"/>
+      <w:pPr>
+        <w:ind w:left="3240" w:hanging="360"/>
+      </w:pPr>
+      <w:rPr>
+        <w:rFonts w:ascii="Symbol" w:hAnsi="Symbol" w:hint="default"/>
+      </w:rPr>
+    </w:lvl>
+    <w:lvl w:ilvl="4" w:tplc="0C000003" w:tentative="1">
+      <w:start w:val="1"/>
+      <w:numFmt w:val="bullet"/>
+      <w:lvlText w:val="o"/>
+      <w:lvlJc w:val="left"/>
+      <w:pPr>
+        <w:ind w:left="3960" w:hanging="360"/>
+      </w:pPr>
+      <w:rPr>
+        <w:rFonts w:ascii="Courier New" w:hAnsi="Courier New" w:cs="Courier New" w:hint="default"/>
+      </w:rPr>
+    </w:lvl>
+    <w:lvl w:ilvl="5" w:tplc="0C000005" w:tentative="1">
+      <w:start w:val="1"/>
+      <w:numFmt w:val="bullet"/>
+      <w:lvlText w:val=""/>
+      <w:lvlJc w:val="left"/>
+      <w:pPr>
+        <w:ind w:left="4680" w:hanging="360"/>
+      </w:pPr>
+      <w:rPr>
+        <w:rFonts w:ascii="Wingdings" w:hAnsi="Wingdings" w:hint="default"/>
+      </w:rPr>
+    </w:lvl>
+    <w:lvl w:ilvl="6" w:tplc="0C000001" w:tentative="1">
+      <w:start w:val="1"/>
+      <w:numFmt w:val="bullet"/>
+      <w:lvlText w:val=""/>
+      <w:lvlJc w:val="left"/>
+      <w:pPr>
+        <w:ind w:left="5400" w:hanging="360"/>
+      </w:pPr>
+      <w:rPr>
+        <w:rFonts w:ascii="Symbol" w:hAnsi="Symbol" w:hint="default"/>
+      </w:rPr>
+    </w:lvl>
+    <w:lvl w:ilvl="7" w:tplc="0C000003" w:tentative="1">
+      <w:start w:val="1"/>
+      <w:numFmt w:val="bullet"/>
+      <w:lvlText w:val="o"/>
+      <w:lvlJc w:val="left"/>
+      <w:pPr>
+        <w:ind w:left="6120" w:hanging="360"/>
+      </w:pPr>
+      <w:rPr>
+        <w:rFonts w:ascii="Courier New" w:hAnsi="Courier New" w:cs="Courier New" w:hint="default"/>
+      </w:rPr>
+    </w:lvl>
+    <w:lvl w:ilvl="8" w:tplc="0C000005" w:tentative="1">
+      <w:start w:val="1"/>
+      <w:numFmt w:val="bullet"/>
+      <w:lvlText w:val=""/>
+      <w:lvlJc w:val="left"/>
+      <w:pPr>
+        <w:ind w:left="6840" w:hanging="360"/>
+      </w:pPr>
+      <w:rPr>
+        <w:rFonts w:ascii="Wingdings" w:hAnsi="Wingdings" w:hint="default"/>
+      </w:rPr>
+    </w:lvl>
+  </w:abstractNum>
   <w:num w:numId="1" w16cid:durableId="749473186">
+    <w:abstractNumId w:val="7"/>
+  </w:num>
+  <w:num w:numId="2" w16cid:durableId="530218053">
+    <w:abstractNumId w:val="6"/>
+  </w:num>
+  <w:num w:numId="3" w16cid:durableId="1533422153">
+    <w:abstractNumId w:val="4"/>
+  </w:num>
+  <w:num w:numId="4" w16cid:durableId="1089891296">
+    <w:abstractNumId w:val="5"/>
+  </w:num>
+  <w:num w:numId="5" w16cid:durableId="1448819747">
+    <w:abstractNumId w:val="8"/>
+  </w:num>
+  <w:num w:numId="6" w16cid:durableId="775758987">
+    <w:abstractNumId w:val="1"/>
+  </w:num>
+  <w:num w:numId="7" w16cid:durableId="396246429">
+    <w:abstractNumId w:val="9"/>
+  </w:num>
+  <w:num w:numId="8" w16cid:durableId="389378750">
     <w:abstractNumId w:val="2"/>
   </w:num>
-  <w:num w:numId="2" w16cid:durableId="530218053">
-    <w:abstractNumId w:val="1"/>
+  <w:num w:numId="9" w16cid:durableId="1819689682">
+    <w:abstractNumId w:val="3"/>
   </w:num>
-  <w:num w:numId="3" w16cid:durableId="1533422153">
+  <w:num w:numId="10" w16cid:durableId="511071015">
     <w:abstractNumId w:val="0"/>
   </w:num>
   <w:numIdMacAtCleanup w:val="3"/>
@@ -1659,6 +3591,7 @@
   <w:style w:type="character" w:default="1" w:styleId="DefaultParagraphFont">
     <w:name w:val="Default Paragraph Font"/>
     <w:uiPriority w:val="1"/>
+    <w:semiHidden/>
     <w:unhideWhenUsed/>
   </w:style>
   <w:style w:type="table" w:default="1" w:styleId="TableNormal">

</xml_diff>